<commit_message>
Updated URLs and schema
</commit_message>
<xml_diff>
--- a/Resources/REACT_Architecture.docx
+++ b/Resources/REACT_Architecture.docx
@@ -58,7 +58,7 @@
         <w:rPr>
           <w:sz w:val="20"/>
         </w:rPr>
-        <w:t>REACT is a Just-In-Time Adaptive Intervention (JITAI) mHealth platform built for University of Florida football fans. It collects physiological data from Garmin wearables via Labfront, captures in-app behavioral signals from the React Native mobile app, administers Ecological Momentary Assessment (EMA) surveys, and delivers personalized behavioral nudges via push notification when a participant is in a high-risk or emotionally volatile state during game windows.</w:t>
+        <w:t>REACT is a Just-In-Time Adaptive Intervention (JITAI) mHealth platform built for University of Florida study participants. It collects physiological data from Garmin wearables via Labfront, captures in-app behavioral signals from the React Native mobile app, administers Ecological Momentary Assessment (EMA) surveys, and delivers personalized behavioral nudges via push notification when a participant is in a high-risk or emotionally volatile state.</w:t>
       </w:r>
     </w:p>
     <w:p>
@@ -183,7 +183,7 @@
               <w:rPr>
                 <w:sz w:val="17"/>
               </w:rPr>
-              <w:t>Participant wears device during UF football game window. Device syncs physiological data to Garmin Health API on movement/schedule.</w:t>
+              <w:t>Participant wears device. Device syncs physiological data to Garmin Health API on movement/schedule.</w:t>
             </w:r>
           </w:p>
         </w:tc>
@@ -268,7 +268,7 @@
               <w:rPr>
                 <w:sz w:val="17"/>
               </w:rPr>
-              <w:t>Polls Labfront API every 2–3 min during game windows. Writes HeartRateSample (15-sec HR), StressSample (3-min epochs), and SleepSummary rows to PostgreSQL.</w:t>
+              <w:t>Polls Labfront API every 2–3 min. Writes HeartRateSample (15-sec HR) and StressSample (3-min epochs) rows to PostgreSQL.</w:t>
             </w:r>
           </w:p>
         </w:tc>
@@ -468,13 +468,12 @@
           <w:color w:val="003387"/>
           <w:sz w:val="20"/>
         </w:rPr>
-        <w:t xml:space="preserve">What are Compose Churn Signals?  </w:t>
+        <w:t>What are Compose Churn Signals?  Compose churn signals are behavioral dysregulation markers captured from the in-app compose surface — the screen where participants type responses or interact with content. Unlike wearable signals (which measure physiology) or EMA responses (which measure self-reported mood), compose churn signals measure how a participant is interacting with the app itself at a micro-behavioral level.</w:t>
       </w:r>
       <w:r>
         <w:rPr>
           <w:sz w:val="20"/>
         </w:rPr>
-        <w:t>Compose churn signals are behavioral dysregulation markers captured from the in-app compose surface — the screen where participants type responses or interact with content during game windows. Unlike wearable signals (which measure physiology) or EMA responses (which measure self-reported mood), compose churn signals measure how a participant is interacting with the app itself at a micro-behavioral level.</w:t>
       </w:r>
     </w:p>
     <w:p>
@@ -2437,7 +2436,7 @@
           <w:i/>
           <w:sz w:val="19"/>
         </w:rPr>
-        <w:t>Raw HR stream ingested from Labfront at 15-second resolution during game windows.</w:t>
+        <w:t>Raw HR stream ingested from Labfront at 15-second resolution.</w:t>
       </w:r>
     </w:p>
     <w:tbl>
@@ -4073,7 +4072,7 @@
           <w:i/>
           <w:sz w:val="19"/>
         </w:rPr>
-        <w:t>In-app compose surface behavioral events. One row per discrete client-side event. Captures compose churn signals (keystroke_count, delete_count) in the metadata JSONB field on draft events. Content-free by design and IRB requirement: metadata may only contain counts, durations, and categorical values — never message text. This constraint is enforced at the Django model layer with a validator that rejects string metadata values exceeding 50 characters. Distinct from wearable telemetry (heart_rate_sample, stress_sample) and from the JITAI decision log (jitai_log). The dual timestamps (occurred_at = client-side, recorded_at = server-side) allow researchers to detect offline usage and sync delays. session_id groups all events within a single app session, enabling reconstruction of a complete behavioral sequence. game_clock_state (pre/live/post) is stamped at ingest time from the current game window state so researchers can segment behavior by game phase without joining to external game data.</w:t>
+        <w:t>In-app compose surface behavioral events. One row per discrete client-side event. Captures compose churn signals (keystroke_count, delete_count) in the metadata JSONB field on draft events. Content-free by design and IRB requirement: metadata may only contain counts, durations, and categorical values — never message text. This constraint is enforced at the Django model layer with a validator that rejects string metadata values exceeding 50 characters. Distinct from wearable telemetry (heart_rate_sample, stress_sample) and from the JITAI decision log (jitai_log). The dual timestamps (occurred_at = client-side, recorded_at = server-side) allow researchers to detect offline usage and sync delays. session_id groups all events within a single app session, enabling reconstruction of a complete behavioral sequence. game_clock_state (pre/live/post) is stamped at ingest time from the current study context so researchers can segment behavior by study phase without joining to external game data.</w:t>
       </w:r>
     </w:p>
     <w:tbl>
@@ -4968,13 +4967,12 @@
           <w:b/>
           <w:sz w:val="20"/>
         </w:rPr>
-        <w:t xml:space="preserve">Path 1: Wearable pipeline (pull-based, server-initiated).  </w:t>
+        <w:t>Path 1: Wearable pipeline (pull-based, server-initiated).  The ingest_wearable_data Celery task runs every 2–3 minutes. It iterates over all enrolled participants with an active wearable_device record, calls the Labfront API using the study-level API key and each participant’s labfront_participant_id, and writes rows to heart_rate_sample and stress_sample. After a successful pull, it updates wearable_device.last_synced_at. No public Django endpoint receives data from Labfront — data only flows inward via this scheduled task. The Labfront API key is stored as a Heroku config var (environment variable) and is never committed to source control.</w:t>
       </w:r>
       <w:r>
         <w:rPr>
           <w:sz w:val="20"/>
         </w:rPr>
-        <w:t>The ingest_wearable_data Celery task runs every 2–3 minutes during game windows. It iterates over all enrolled participants with an active wearable_device record, calls the Labfront API using the study-level API key and each participant’s labfront_participant_id, and writes rows to heart_rate_sample, stress_sample, and sleep_summary. After a successful pull, it updates wearable_device.last_synced_at. No public Django endpoint receives data from Labfront — data only flows inward via this scheduled task. The Labfront API key is stored as a Heroku config var (environment variable) and is never committed to source control.</w:t>
       </w:r>
     </w:p>
     <w:p>
@@ -4983,13 +4981,12 @@
           <w:b/>
           <w:sz w:val="20"/>
         </w:rPr>
-        <w:t xml:space="preserve">Path 2: Phone telemetry pipeline (push-based, client-initiated).  </w:t>
+        <w:t>Path 2: Phone telemetry pipeline (push-based, client-initiated).  The React Native app fires POST requests to /telemetry/phone/ and /telemetry/engagement/ in real time as the participant interacts with the compose surface or engages with EMA prompts and notifications. The Django REST API authenticates the request via JWT, validates the payload (including the IRB metadata constraint), stamps recorded_at, derives game_clock_state from the current study context, and writes to phone_telemetry or engagement_log. This path is synchronous and participant-device-initiated, in contrast to the wearable pipeline which is asynchronous and server-initiated.</w:t>
       </w:r>
       <w:r>
         <w:rPr>
           <w:sz w:val="20"/>
         </w:rPr>
-        <w:t>The React Native app fires POST requests to /telemetry/phone/ and /telemetry/engagement/ in real time as the participant interacts with the compose surface or engages with EMA prompts and notifications. The Django REST API authenticates the request via JWT, validates the payload (including the IRB metadata constraint), stamps recorded_at, derives game_clock_state from the current game window state, and writes to phone_telemetry or engagement_log. This path is synchronous and participant-device-initiated, in contrast to the wearable pipeline which is asynchronous and server-initiated.</w:t>
       </w:r>
     </w:p>
     <w:p>
@@ -5028,13 +5025,12 @@
           <w:b/>
           <w:sz w:val="20"/>
         </w:rPr>
-        <w:t xml:space="preserve">Celery + Redis architecture on Heroku.  </w:t>
+        <w:t>Celery + Redis architecture on Heroku.  Celery Beat (scheduler) and Celery Worker (executor) run as separate Heroku dynos. Redis serves as the message broker between them — Beat enqueues tasks to Redis, Worker dequeues and executes them. This separation is architecturally required: a single dyno cannot reliably run both the scheduler and the worker because Heroku dynos can be restarted at any time, and a combined process would lose queued tasks on restart. Redis is not redundant — it is the broker that makes the Beat/Worker split possible. For ~300 participants polled every 2–3 minutes, the task volume is well within a single Worker dyno’s capacity.</w:t>
       </w:r>
       <w:r>
         <w:rPr>
           <w:sz w:val="20"/>
         </w:rPr>
-        <w:t>Celery Beat (scheduler) and Celery Worker (executor) run as separate Heroku dynos. Redis serves as the message broker between them — Beat enqueues tasks to Redis, Worker dequeues and executes them. This separation is architecturally required: a single dyno cannot reliably run both the scheduler and the worker because Heroku dynos can be restarted at any time, and a combined process would lose queued tasks on restart. Redis is not redundant — it is the broker that makes the Beat/Worker split possible. For ~300 participants polled every 2–3 minutes during game windows, the task volume is well within a single Worker dyno’s capacity.</w:t>
       </w:r>
     </w:p>
     <w:p/>

</xml_diff>

<commit_message>
Implemented JITAI engine into Celery and Created a notification service to decouple from tasks.py
</commit_message>
<xml_diff>
--- a/Resources/REACT_Architecture.docx
+++ b/Resources/REACT_Architecture.docx
@@ -268,7 +268,7 @@
               <w:rPr>
                 <w:sz w:val="17"/>
               </w:rPr>
-              <w:t>Polls Labfront API every 2–3 min. Writes HeartRateSample (15-sec HR) and StressSample (3-min epochs) rows to PostgreSQL.</w:t>
+              <w:t>[Stub — Labfront API integration pending] Polls Labfront API every 2–3 min. Will write HeartRateSample (15-sec HR) and StressSample (3-min epochs) rows to PostgreSQL.</w:t>
             </w:r>
           </w:p>
         </w:tc>
@@ -312,7 +312,7 @@
               <w:rPr>
                 <w:sz w:val="17"/>
               </w:rPr>
-              <w:t>Reads recent EMA rows per enrolled participant. Computes MSSD (Mean Square Successive Difference) as a within-person volatility metric. Checks threshold, cooldown window, and daily prompt cap. Writes a JITAILog row (send_prompt = True/False). If send_prompt is True, fires Expo push notification.</w:t>
+              <w:t>Reads recent EMA rows per enrolled participant. Computes MSSD via decision_engine.py (calculate_mssd → apply_decision_rules). Cooldown (60 min) and daily cap (4/day) enforced by the decision engine. Writes a JITAILog row (send_prompt = True/False). If send_prompt is True, fires Expo push notification (silent, prompt_id only).</w:t>
             </w:r>
           </w:p>
         </w:tc>
@@ -1331,6 +1331,47 @@
                 <w:sz w:val="17"/>
               </w:rPr>
               <w:t>Ingest EMA / notification engagement event from mobile app</w:t>
+            </w:r>
+          </w:p>
+        </w:tc>
+      </w:tr>
+      <w:tr>
+        <w:tc>
+          <w:tcPr>
+            <w:tcW w:type="dxa" w:w="3249"/>
+          </w:tcPr>
+          <w:p>
+            <w:r>
+              <w:rPr>
+                <w:sz w:val="17"/>
+              </w:rPr>
+              <w:t>POST</w:t>
+            </w:r>
+          </w:p>
+        </w:tc>
+        <w:tc>
+          <w:tcPr>
+            <w:tcW w:type="dxa" w:w="3249"/>
+          </w:tcPr>
+          <w:p>
+            <w:r>
+              <w:rPr>
+                <w:sz w:val="17"/>
+              </w:rPr>
+              <w:t>/telemetry/ingest/</w:t>
+            </w:r>
+          </w:p>
+        </w:tc>
+        <w:tc>
+          <w:tcPr>
+            <w:tcW w:type="dxa" w:w="3249"/>
+          </w:tcPr>
+          <w:p>
+            <w:r>
+              <w:rPr>
+                <w:sz w:val="17"/>
+              </w:rPr>
+              <w:t>Dev/staging testing endpoint — not part of the production data flow. In production, wearable data is written directly to the DB via Celery ORM (ingest_wearable_data task). This endpoint exists for local testing only.</w:t>
             </w:r>
           </w:p>
         </w:tc>

</xml_diff>

<commit_message>
Fix push payload, drop legacy schema, add notification service tests
- Add type and jitai_log_id to Expo push payload so mobile can link
  engagement events back to the JITAI decision that triggered them
- Add SendJITAIPromptTests (5 tests) covering payload shape, no-token
  early return, device-not-registered handling, and push errors
- Drop device_name from WearableDevice and UserData model entirely
  (migrations 0032, 0033); rename fitabase_participant_id to
  labfront_participant_id throughout
- Update react_schema.csv: remove legacy user fields and user_data
  table, add phone_telemetry and engagement_log tables
- Update REACT_API_Contract.docx: remove stale not-implemented note,
  confirm push payload shape
- Resolve merge conflicts in serializers.py and tests.py from upstream
</commit_message>
<xml_diff>
--- a/Resources/REACT_Architecture.docx
+++ b/Resources/REACT_Architecture.docx
@@ -268,7 +268,7 @@
               <w:rPr>
                 <w:sz w:val="17"/>
               </w:rPr>
-              <w:t>[Stub — Labfront API integration pending] Polls Labfront API every 2–3 min. Will write HeartRateSample (15-sec HR) and StressSample (3-min epochs) rows to PostgreSQL.</w:t>
+              <w:t>Polls Labfront API every 2–3 min. Writes HeartRateSample (15-sec HR) and StressSample (3-min epochs) rows to PostgreSQL.</w:t>
             </w:r>
           </w:p>
         </w:tc>
@@ -312,7 +312,7 @@
               <w:rPr>
                 <w:sz w:val="17"/>
               </w:rPr>
-              <w:t>Reads recent EMA rows per enrolled participant. Computes MSSD via decision_engine.py (calculate_mssd → apply_decision_rules). Cooldown (60 min) and daily cap (4/day) enforced by the decision engine. Writes a JITAILog row (send_prompt = True/False). If send_prompt is True, fires Expo push notification (silent, prompt_id only).</w:t>
+              <w:t>Reads recent EMA rows per enrolled participant. Computes MSSD (Mean Square Successive Difference) as a within-person volatility metric. Checks threshold, cooldown window, and daily prompt cap. Writes a JITAILog row (send_prompt = True/False). If send_prompt is True, fires Expo push notification.</w:t>
             </w:r>
           </w:p>
         </w:tc>
@@ -794,7 +794,7 @@
               <w:rPr>
                 <w:sz w:val="17"/>
               </w:rPr>
-              <w:t>GET</w:t>
+              <w:t>POST</w:t>
             </w:r>
           </w:p>
         </w:tc>
@@ -807,7 +807,7 @@
               <w:rPr>
                 <w:sz w:val="17"/>
               </w:rPr>
-              <w:t>/userdata/latest/{user_id}/</w:t>
+              <w:t>/wearable/</w:t>
             </w:r>
           </w:p>
         </w:tc>
@@ -820,7 +820,7 @@
               <w:rPr>
                 <w:sz w:val="17"/>
               </w:rPr>
-              <w:t>Get latest user progress snapshot</w:t>
+              <w:t>Register Labfront participant ID on enrollment</w:t>
             </w:r>
           </w:p>
         </w:tc>
@@ -836,7 +836,7 @@
               <w:rPr>
                 <w:sz w:val="17"/>
               </w:rPr>
-              <w:t>POST</w:t>
+              <w:t>GET</w:t>
             </w:r>
           </w:p>
         </w:tc>
@@ -850,7 +850,7 @@
               <w:rPr>
                 <w:sz w:val="17"/>
               </w:rPr>
-              <w:t>/userdata/{user_id}/</w:t>
+              <w:t>/wearable/{user_id}/</w:t>
             </w:r>
           </w:p>
         </w:tc>
@@ -864,7 +864,7 @@
               <w:rPr>
                 <w:sz w:val="17"/>
               </w:rPr>
-              <w:t>Log user progress</w:t>
+              <w:t>Get device record</w:t>
             </w:r>
           </w:p>
         </w:tc>
@@ -879,7 +879,7 @@
               <w:rPr>
                 <w:sz w:val="17"/>
               </w:rPr>
-              <w:t>POST</w:t>
+              <w:t>PATCH</w:t>
             </w:r>
           </w:p>
         </w:tc>
@@ -892,7 +892,7 @@
               <w:rPr>
                 <w:sz w:val="17"/>
               </w:rPr>
-              <w:t>/wearable/</w:t>
+              <w:t>/wearable/{user_id}/</w:t>
             </w:r>
           </w:p>
         </w:tc>
@@ -905,7 +905,7 @@
               <w:rPr>
                 <w:sz w:val="17"/>
               </w:rPr>
-              <w:t>Register Labfront participant ID on enrollment</w:t>
+              <w:t>Update device record (e.g. last_synced_at)</w:t>
             </w:r>
           </w:p>
         </w:tc>
@@ -921,7 +921,7 @@
               <w:rPr>
                 <w:sz w:val="17"/>
               </w:rPr>
-              <w:t>GET</w:t>
+              <w:t>POST</w:t>
             </w:r>
           </w:p>
         </w:tc>
@@ -935,7 +935,7 @@
               <w:rPr>
                 <w:sz w:val="17"/>
               </w:rPr>
-              <w:t>/wearable/{user_id}/</w:t>
+              <w:t>/ema/</w:t>
             </w:r>
           </w:p>
         </w:tc>
@@ -949,7 +949,7 @@
               <w:rPr>
                 <w:sz w:val="17"/>
               </w:rPr>
-              <w:t>Get device record</w:t>
+              <w:t>Submit EMA response from mobile app</w:t>
             </w:r>
           </w:p>
         </w:tc>
@@ -964,7 +964,7 @@
               <w:rPr>
                 <w:sz w:val="17"/>
               </w:rPr>
-              <w:t>PATCH</w:t>
+              <w:t>GET</w:t>
             </w:r>
           </w:p>
         </w:tc>
@@ -977,7 +977,7 @@
               <w:rPr>
                 <w:sz w:val="17"/>
               </w:rPr>
-              <w:t>/wearable/{user_id}/</w:t>
+              <w:t>/ema/{user_id}/</w:t>
             </w:r>
           </w:p>
         </w:tc>
@@ -990,7 +990,7 @@
               <w:rPr>
                 <w:sz w:val="17"/>
               </w:rPr>
-              <w:t>Update device record (e.g. last_synced_at)</w:t>
+              <w:t>Fetch EMA history (dashboard / admin)</w:t>
             </w:r>
           </w:p>
         </w:tc>
@@ -1020,7 +1020,7 @@
               <w:rPr>
                 <w:sz w:val="17"/>
               </w:rPr>
-              <w:t>/ema/</w:t>
+              <w:t>/jitai/</w:t>
             </w:r>
           </w:p>
         </w:tc>
@@ -1034,7 +1034,7 @@
               <w:rPr>
                 <w:sz w:val="17"/>
               </w:rPr>
-              <w:t>Submit EMA response from mobile app</w:t>
+              <w:t>Internal — Celery logs a triggered intervention</w:t>
             </w:r>
           </w:p>
         </w:tc>
@@ -1062,7 +1062,7 @@
               <w:rPr>
                 <w:sz w:val="17"/>
               </w:rPr>
-              <w:t>/ema/{user_id}/</w:t>
+              <w:t>/jitai/{user_id}/</w:t>
             </w:r>
           </w:p>
         </w:tc>
@@ -1075,7 +1075,7 @@
               <w:rPr>
                 <w:sz w:val="17"/>
               </w:rPr>
-              <w:t>Fetch EMA history (dashboard / admin)</w:t>
+              <w:t>Fetch JITAI history (dashboard / admin)</w:t>
             </w:r>
           </w:p>
         </w:tc>
@@ -1091,7 +1091,7 @@
               <w:rPr>
                 <w:sz w:val="17"/>
               </w:rPr>
-              <w:t>POST</w:t>
+              <w:t>GET</w:t>
             </w:r>
           </w:p>
         </w:tc>
@@ -1105,7 +1105,7 @@
               <w:rPr>
                 <w:sz w:val="17"/>
               </w:rPr>
-              <w:t>/jitai/</w:t>
+              <w:t>/telemetry/hr/{user_id}/</w:t>
             </w:r>
           </w:p>
         </w:tc>
@@ -1119,7 +1119,7 @@
               <w:rPr>
                 <w:sz w:val="17"/>
               </w:rPr>
-              <w:t>Internal — Celery logs a triggered intervention</w:t>
+              <w:t>Fetch recent HR samples (dashboard)</w:t>
             </w:r>
           </w:p>
         </w:tc>
@@ -1147,7 +1147,7 @@
               <w:rPr>
                 <w:sz w:val="17"/>
               </w:rPr>
-              <w:t>/jitai/{user_id}/</w:t>
+              <w:t>/telemetry/stress/{user_id}/</w:t>
             </w:r>
           </w:p>
         </w:tc>
@@ -1160,7 +1160,7 @@
               <w:rPr>
                 <w:sz w:val="17"/>
               </w:rPr>
-              <w:t>Fetch JITAI history (dashboard / admin)</w:t>
+              <w:t>Fetch recent stress samples (dashboard)</w:t>
             </w:r>
           </w:p>
         </w:tc>
@@ -1176,7 +1176,7 @@
               <w:rPr>
                 <w:sz w:val="17"/>
               </w:rPr>
-              <w:t>GET</w:t>
+              <w:t>POST</w:t>
             </w:r>
           </w:p>
         </w:tc>
@@ -1190,7 +1190,7 @@
               <w:rPr>
                 <w:sz w:val="17"/>
               </w:rPr>
-              <w:t>/telemetry/hr/{user_id}/</w:t>
+              <w:t>/telemetry/phone/</w:t>
             </w:r>
           </w:p>
         </w:tc>
@@ -1204,7 +1204,7 @@
               <w:rPr>
                 <w:sz w:val="17"/>
               </w:rPr>
-              <w:t>Fetch recent HR samples (dashboard)</w:t>
+              <w:t>Ingest compose surface event from mobile app</w:t>
             </w:r>
           </w:p>
         </w:tc>
@@ -1219,7 +1219,7 @@
               <w:rPr>
                 <w:sz w:val="17"/>
               </w:rPr>
-              <w:t>GET</w:t>
+              <w:t>POST</w:t>
             </w:r>
           </w:p>
         </w:tc>
@@ -1232,7 +1232,7 @@
               <w:rPr>
                 <w:sz w:val="17"/>
               </w:rPr>
-              <w:t>/telemetry/stress/{user_id}/</w:t>
+              <w:t>/telemetry/engagement/</w:t>
             </w:r>
           </w:p>
         </w:tc>
@@ -1245,133 +1245,7 @@
               <w:rPr>
                 <w:sz w:val="17"/>
               </w:rPr>
-              <w:t>Fetch recent stress samples (dashboard)</w:t>
-            </w:r>
-          </w:p>
-        </w:tc>
-      </w:tr>
-      <w:tr>
-        <w:tc>
-          <w:tcPr>
-            <w:tcW w:type="dxa" w:w="3249"/>
-            <w:shd w:val="clear" w:color="auto" w:fill="EEF2FA"/>
-          </w:tcPr>
-          <w:p>
-            <w:r>
-              <w:rPr>
-                <w:sz w:val="17"/>
-              </w:rPr>
-              <w:t>POST</w:t>
-            </w:r>
-          </w:p>
-        </w:tc>
-        <w:tc>
-          <w:tcPr>
-            <w:tcW w:type="dxa" w:w="3249"/>
-            <w:shd w:val="clear" w:color="auto" w:fill="EEF2FA"/>
-          </w:tcPr>
-          <w:p>
-            <w:r>
-              <w:rPr>
-                <w:sz w:val="17"/>
-              </w:rPr>
-              <w:t>/telemetry/phone/</w:t>
-            </w:r>
-          </w:p>
-        </w:tc>
-        <w:tc>
-          <w:tcPr>
-            <w:tcW w:type="dxa" w:w="3249"/>
-            <w:shd w:val="clear" w:color="auto" w:fill="EEF2FA"/>
-          </w:tcPr>
-          <w:p>
-            <w:r>
-              <w:rPr>
-                <w:sz w:val="17"/>
-              </w:rPr>
-              <w:t>Ingest compose surface event from mobile app</w:t>
-            </w:r>
-          </w:p>
-        </w:tc>
-      </w:tr>
-      <w:tr>
-        <w:tc>
-          <w:tcPr>
-            <w:tcW w:type="dxa" w:w="3249"/>
-          </w:tcPr>
-          <w:p>
-            <w:r>
-              <w:rPr>
-                <w:sz w:val="17"/>
-              </w:rPr>
-              <w:t>POST</w:t>
-            </w:r>
-          </w:p>
-        </w:tc>
-        <w:tc>
-          <w:tcPr>
-            <w:tcW w:type="dxa" w:w="3249"/>
-          </w:tcPr>
-          <w:p>
-            <w:r>
-              <w:rPr>
-                <w:sz w:val="17"/>
-              </w:rPr>
-              <w:t>/telemetry/engagement/</w:t>
-            </w:r>
-          </w:p>
-        </w:tc>
-        <w:tc>
-          <w:tcPr>
-            <w:tcW w:type="dxa" w:w="3249"/>
-          </w:tcPr>
-          <w:p>
-            <w:r>
-              <w:rPr>
-                <w:sz w:val="17"/>
-              </w:rPr>
               <w:t>Ingest EMA / notification engagement event from mobile app</w:t>
-            </w:r>
-          </w:p>
-        </w:tc>
-      </w:tr>
-      <w:tr>
-        <w:tc>
-          <w:tcPr>
-            <w:tcW w:type="dxa" w:w="3249"/>
-          </w:tcPr>
-          <w:p>
-            <w:r>
-              <w:rPr>
-                <w:sz w:val="17"/>
-              </w:rPr>
-              <w:t>POST</w:t>
-            </w:r>
-          </w:p>
-        </w:tc>
-        <w:tc>
-          <w:tcPr>
-            <w:tcW w:type="dxa" w:w="3249"/>
-          </w:tcPr>
-          <w:p>
-            <w:r>
-              <w:rPr>
-                <w:sz w:val="17"/>
-              </w:rPr>
-              <w:t>/telemetry/ingest/</w:t>
-            </w:r>
-          </w:p>
-        </w:tc>
-        <w:tc>
-          <w:tcPr>
-            <w:tcW w:type="dxa" w:w="3249"/>
-          </w:tcPr>
-          <w:p>
-            <w:r>
-              <w:rPr>
-                <w:sz w:val="17"/>
-              </w:rPr>
-              <w:t>Dev/staging testing endpoint — not part of the production data flow. In production, wearable data is written directly to the DB via Celery ORM (ingest_wearable_data task). This endpoint exists for local testing only.</w:t>
             </w:r>
           </w:p>
         </w:tc>
@@ -1898,223 +1772,6 @@
       </w:tr>
     </w:tbl>
     <w:p/>
-    <w:p>
-      <w:pPr>
-        <w:pStyle w:val="Heading2"/>
-      </w:pPr>
-      <w:r>
-        <w:rPr>
-          <w:color w:val="003387"/>
-        </w:rPr>
-        <w:t>user_data</w:t>
-      </w:r>
-    </w:p>
-    <w:p>
-      <w:r>
-        <w:rPr>
-          <w:i/>
-          <w:sz w:val="19"/>
-        </w:rPr>
-        <w:t>Timestamped participant activity snapshots.</w:t>
-      </w:r>
-    </w:p>
-    <w:tbl>
-      <w:tblPr>
-        <w:tblStyle w:val="TableGrid"/>
-        <w:tblW w:type="auto" w:w="0"/>
-        <w:tblLook w:firstColumn="1" w:firstRow="1" w:lastColumn="0" w:lastRow="0" w:noHBand="0" w:noVBand="1" w:val="04A0"/>
-      </w:tblPr>
-      <w:tblGrid>
-        <w:gridCol w:w="3249"/>
-        <w:gridCol w:w="3249"/>
-        <w:gridCol w:w="3249"/>
-      </w:tblGrid>
-      <w:tr>
-        <w:tc>
-          <w:tcPr>
-            <w:tcW w:type="dxa" w:w="3249"/>
-            <w:shd w:val="clear" w:color="auto" w:fill="003387"/>
-          </w:tcPr>
-          <w:p>
-            <w:pPr>
-              <w:jc w:val="center"/>
-            </w:pPr>
-            <w:r>
-              <w:rPr>
-                <w:b/>
-                <w:color w:val="FFFFFF"/>
-                <w:sz w:val="18"/>
-              </w:rPr>
-              <w:t>Column</w:t>
-            </w:r>
-          </w:p>
-        </w:tc>
-        <w:tc>
-          <w:tcPr>
-            <w:tcW w:type="dxa" w:w="3249"/>
-            <w:shd w:val="clear" w:color="auto" w:fill="003387"/>
-          </w:tcPr>
-          <w:p>
-            <w:pPr>
-              <w:jc w:val="center"/>
-            </w:pPr>
-            <w:r>
-              <w:rPr>
-                <w:b/>
-                <w:color w:val="FFFFFF"/>
-                <w:sz w:val="18"/>
-              </w:rPr>
-              <w:t>Type</w:t>
-            </w:r>
-          </w:p>
-        </w:tc>
-        <w:tc>
-          <w:tcPr>
-            <w:tcW w:type="dxa" w:w="3249"/>
-            <w:shd w:val="clear" w:color="auto" w:fill="003387"/>
-          </w:tcPr>
-          <w:p>
-            <w:pPr>
-              <w:jc w:val="center"/>
-            </w:pPr>
-            <w:r>
-              <w:rPr>
-                <w:b/>
-                <w:color w:val="FFFFFF"/>
-                <w:sz w:val="18"/>
-              </w:rPr>
-              <w:t>Notes / Constraint</w:t>
-            </w:r>
-          </w:p>
-        </w:tc>
-      </w:tr>
-      <w:tr>
-        <w:tc>
-          <w:tcPr>
-            <w:tcW w:type="dxa" w:w="3249"/>
-          </w:tcPr>
-          <w:p>
-            <w:r>
-              <w:rPr>
-                <w:sz w:val="17"/>
-              </w:rPr>
-              <w:t>data_id</w:t>
-            </w:r>
-          </w:p>
-        </w:tc>
-        <w:tc>
-          <w:tcPr>
-            <w:tcW w:type="dxa" w:w="3249"/>
-          </w:tcPr>
-          <w:p>
-            <w:r>
-              <w:rPr>
-                <w:sz w:val="17"/>
-              </w:rPr>
-              <w:t>INT</w:t>
-            </w:r>
-          </w:p>
-        </w:tc>
-        <w:tc>
-          <w:tcPr>
-            <w:tcW w:type="dxa" w:w="3249"/>
-          </w:tcPr>
-          <w:p>
-            <w:r>
-              <w:rPr>
-                <w:sz w:val="17"/>
-              </w:rPr>
-              <w:t>PRIMARY KEY</w:t>
-            </w:r>
-          </w:p>
-        </w:tc>
-      </w:tr>
-      <w:tr>
-        <w:tc>
-          <w:tcPr>
-            <w:tcW w:type="dxa" w:w="3249"/>
-            <w:shd w:val="clear" w:color="auto" w:fill="EEF2FA"/>
-          </w:tcPr>
-          <w:p>
-            <w:r>
-              <w:rPr>
-                <w:sz w:val="17"/>
-              </w:rPr>
-              <w:t>user_id</w:t>
-            </w:r>
-          </w:p>
-        </w:tc>
-        <w:tc>
-          <w:tcPr>
-            <w:tcW w:type="dxa" w:w="3249"/>
-            <w:shd w:val="clear" w:color="auto" w:fill="EEF2FA"/>
-          </w:tcPr>
-          <w:p>
-            <w:r>
-              <w:rPr>
-                <w:sz w:val="17"/>
-              </w:rPr>
-              <w:t>INT</w:t>
-            </w:r>
-          </w:p>
-        </w:tc>
-        <w:tc>
-          <w:tcPr>
-            <w:tcW w:type="dxa" w:w="3249"/>
-            <w:shd w:val="clear" w:color="auto" w:fill="EEF2FA"/>
-          </w:tcPr>
-          <w:p>
-            <w:r>
-              <w:rPr>
-                <w:sz w:val="17"/>
-              </w:rPr>
-              <w:t>FK → user</w:t>
-            </w:r>
-          </w:p>
-        </w:tc>
-      </w:tr>
-      <w:tr>
-        <w:tc>
-          <w:tcPr>
-            <w:tcW w:type="dxa" w:w="3249"/>
-          </w:tcPr>
-          <w:p>
-            <w:r>
-              <w:rPr>
-                <w:sz w:val="17"/>
-              </w:rPr>
-              <w:t>timestamp</w:t>
-            </w:r>
-          </w:p>
-        </w:tc>
-        <w:tc>
-          <w:tcPr>
-            <w:tcW w:type="dxa" w:w="3249"/>
-          </w:tcPr>
-          <w:p>
-            <w:r>
-              <w:rPr>
-                <w:sz w:val="17"/>
-              </w:rPr>
-              <w:t>DATETIME</w:t>
-            </w:r>
-          </w:p>
-        </w:tc>
-        <w:tc>
-          <w:tcPr>
-            <w:tcW w:type="dxa" w:w="3249"/>
-          </w:tcPr>
-          <w:p>
-            <w:r>
-              <w:rPr>
-                <w:sz w:val="17"/>
-              </w:rPr>
-              <w:t>auto set on create</w:t>
-            </w:r>
-          </w:p>
-        </w:tc>
-      </w:tr>
-    </w:tbl>
     <w:p/>
     <w:p>
       <w:pPr>
@@ -2328,49 +1985,6 @@
                 <w:sz w:val="17"/>
               </w:rPr>
               <w:t>UNIQUE</w:t>
-            </w:r>
-          </w:p>
-        </w:tc>
-      </w:tr>
-      <w:tr>
-        <w:tc>
-          <w:tcPr>
-            <w:tcW w:type="dxa" w:w="3249"/>
-            <w:shd w:val="clear" w:color="auto" w:fill="EEF2FA"/>
-          </w:tcPr>
-          <w:p>
-            <w:r>
-              <w:rPr>
-                <w:sz w:val="17"/>
-              </w:rPr>
-              <w:t>device_name</w:t>
-            </w:r>
-          </w:p>
-        </w:tc>
-        <w:tc>
-          <w:tcPr>
-            <w:tcW w:type="dxa" w:w="3249"/>
-            <w:shd w:val="clear" w:color="auto" w:fill="EEF2FA"/>
-          </w:tcPr>
-          <w:p>
-            <w:r>
-              <w:rPr>
-                <w:sz w:val="17"/>
-              </w:rPr>
-              <w:t>VARCHAR(100)</w:t>
-            </w:r>
-          </w:p>
-        </w:tc>
-        <w:tc>
-          <w:tcPr>
-            <w:tcW w:type="dxa" w:w="3249"/>
-            <w:shd w:val="clear" w:color="auto" w:fill="EEF2FA"/>
-          </w:tcPr>
-          <w:p>
-            <w:r>
-              <w:rPr>
-                <w:sz w:val="17"/>
-              </w:rPr>
             </w:r>
           </w:p>
         </w:tc>
@@ -5408,7 +5022,7 @@
           <w:color w:val="444444"/>
           <w:sz w:val="16"/>
         </w:rPr>
-        <w:t>Last updated: 2026-06-23 · Author: Dustin Nguyen · SMASH Research Lab, UF</w:t>
+        <w:t>Last updated: 2026-07-01 · Author: Dustin Nguyen · SMASH Research Lab, UF</w:t>
       </w:r>
     </w:p>
     <w:sectPr>

</xml_diff>

<commit_message>
feat: add jitai_demo management command and fix celery app registration
Moves randomization probability lookup out of the per-user loop in
evaluate_jitai_triggers, wires up celery_app in project/__init__.py so
@shared_task decorators resolve, and adds a demo.sh + jitai_demo command
for manually exercising the JITAI Celery worker locally.
</commit_message>
<xml_diff>
--- a/Resources/REACT_Architecture.docx
+++ b/Resources/REACT_Architecture.docx
@@ -3703,7 +3703,130 @@
               <w:rPr>
                 <w:sz w:val="17"/>
               </w:rPr>
-              <w:t>delivered / opened / interacted / failed</w:t>
+              <w:t>pending → delivered / not_sent / failed / opened / interacted</w:t>
+            </w:r>
+          </w:p>
+        </w:tc>
+      </w:tr>
+      <w:tr>
+        <w:tc>
+          <w:tcPr>
+            <w:tcW w:type="dxa" w:w="3249"/>
+          </w:tcPr>
+          <w:p>
+            <w:r>
+              <w:rPr>
+                <w:sz w:val="17"/>
+              </w:rPr>
+              <w:t>decision_point_id</w:t>
+            </w:r>
+          </w:p>
+        </w:tc>
+        <w:tc>
+          <w:tcPr>
+            <w:tcW w:type="dxa" w:w="3249"/>
+          </w:tcPr>
+          <w:p>
+            <w:r>
+              <w:rPr>
+                <w:sz w:val="17"/>
+              </w:rPr>
+              <w:t>VARCHAR(64)</w:t>
+            </w:r>
+          </w:p>
+        </w:tc>
+        <w:tc>
+          <w:tcPr>
+            <w:tcW w:type="dxa" w:w="3249"/>
+          </w:tcPr>
+          <w:p>
+            <w:r>
+              <w:rPr>
+                <w:sz w:val="17"/>
+              </w:rPr>
+              <w:t>UNIQUE — idempotency key; format: ema_&lt;ema_pk&gt;</w:t>
+            </w:r>
+          </w:p>
+        </w:tc>
+      </w:tr>
+      <w:tr>
+        <w:tc>
+          <w:tcPr>
+            <w:tcW w:type="dxa" w:w="3249"/>
+          </w:tcPr>
+          <w:p>
+            <w:r>
+              <w:rPr>
+                <w:sz w:val="17"/>
+              </w:rPr>
+              <w:t>randomization_probability</w:t>
+            </w:r>
+          </w:p>
+        </w:tc>
+        <w:tc>
+          <w:tcPr>
+            <w:tcW w:type="dxa" w:w="3249"/>
+          </w:tcPr>
+          <w:p>
+            <w:r>
+              <w:rPr>
+                <w:sz w:val="17"/>
+              </w:rPr>
+              <w:t>FLOAT</w:t>
+            </w:r>
+          </w:p>
+        </w:tc>
+        <w:tc>
+          <w:tcPr>
+            <w:tcW w:type="dxa" w:w="3249"/>
+          </w:tcPr>
+          <w:p>
+            <w:r>
+              <w:rPr>
+                <w:sz w:val="17"/>
+              </w:rPr>
+              <w:t>p value used for coin flip at this decision point</w:t>
+            </w:r>
+          </w:p>
+        </w:tc>
+      </w:tr>
+      <w:tr>
+        <w:tc>
+          <w:tcPr>
+            <w:tcW w:type="dxa" w:w="3249"/>
+          </w:tcPr>
+          <w:p>
+            <w:r>
+              <w:rPr>
+                <w:sz w:val="17"/>
+              </w:rPr>
+              <w:t>randomization_draw</w:t>
+            </w:r>
+          </w:p>
+        </w:tc>
+        <w:tc>
+          <w:tcPr>
+            <w:tcW w:type="dxa" w:w="3249"/>
+          </w:tcPr>
+          <w:p>
+            <w:r>
+              <w:rPr>
+                <w:sz w:val="17"/>
+              </w:rPr>
+              <w:t>FLOAT</w:t>
+            </w:r>
+          </w:p>
+        </w:tc>
+        <w:tc>
+          <w:tcPr>
+            <w:tcW w:type="dxa" w:w="3249"/>
+          </w:tcPr>
+          <w:p>
+            <w:r>
+              <w:rPr>
+                <w:sz w:val="17"/>
+              </w:rPr>
+              <w:t>Uniform(0,1) draw; NULL when control / ineligible</w:t>
             </w:r>
           </w:p>
         </w:tc>
@@ -4932,6 +5055,2034 @@
     <w:p/>
     <w:p>
       <w:pPr>
+        <w:pStyle w:val="Heading1"/>
+      </w:pPr>
+      <w:r>
+        <w:t>6. Research Construct Map</w:t>
+      </w:r>
+    </w:p>
+    <w:p>
+      <w:r>
+        <w:t>Every database field mapped to the research construct it serves. Fields that are pure infrastructure (PKs, FKs, server timestamps) are noted as such.</w:t>
+      </w:r>
+    </w:p>
+    <w:p>
+      <w:r>
+        <w:t/>
+      </w:r>
+    </w:p>
+    <w:tbl>
+      <w:tblPr>
+        <w:tblStyle w:val="TableGrid"/>
+        <w:tblW w:type="auto" w:w="0"/>
+        <w:tblLook w:firstColumn="1" w:firstRow="1" w:lastColumn="0" w:lastRow="0" w:noHBand="0" w:noVBand="1" w:val="04A0"/>
+      </w:tblPr>
+      <w:tblGrid>
+        <w:gridCol w:w="3249"/>
+        <w:gridCol w:w="3249"/>
+        <w:gridCol w:w="3249"/>
+      </w:tblGrid>
+      <w:tr>
+        <w:tc>
+          <w:tcPr>
+            <w:tcW w:type="dxa" w:w="3249"/>
+          </w:tcPr>
+          <w:p>
+            <w:r>
+              <w:rPr>
+                <w:b/>
+              </w:rPr>
+              <w:t>Table</w:t>
+            </w:r>
+          </w:p>
+        </w:tc>
+        <w:tc>
+          <w:tcPr>
+            <w:tcW w:type="dxa" w:w="3249"/>
+          </w:tcPr>
+          <w:p>
+            <w:r>
+              <w:rPr>
+                <w:b/>
+              </w:rPr>
+              <w:t>Field</w:t>
+            </w:r>
+          </w:p>
+        </w:tc>
+        <w:tc>
+          <w:tcPr>
+            <w:tcW w:type="dxa" w:w="3249"/>
+          </w:tcPr>
+          <w:p>
+            <w:r>
+              <w:rPr>
+                <w:b/>
+              </w:rPr>
+              <w:t>Construct</w:t>
+            </w:r>
+          </w:p>
+        </w:tc>
+      </w:tr>
+      <w:tr>
+        <w:tc>
+          <w:tcPr>
+            <w:tcW w:type="dxa" w:w="3249"/>
+          </w:tcPr>
+          <w:p>
+            <w:r>
+              <w:t>user</w:t>
+            </w:r>
+          </w:p>
+        </w:tc>
+        <w:tc>
+          <w:tcPr>
+            <w:tcW w:type="dxa" w:w="3249"/>
+          </w:tcPr>
+          <w:p>
+            <w:r>
+              <w:t>user_id</w:t>
+            </w:r>
+          </w:p>
+        </w:tc>
+        <w:tc>
+          <w:tcPr>
+            <w:tcW w:type="dxa" w:w="3249"/>
+          </w:tcPr>
+          <w:p>
+            <w:r>
+              <w:t>Infrastructure — primary key</w:t>
+            </w:r>
+          </w:p>
+        </w:tc>
+      </w:tr>
+      <w:tr>
+        <w:tc>
+          <w:tcPr>
+            <w:tcW w:type="dxa" w:w="3249"/>
+          </w:tcPr>
+          <w:p>
+            <w:r>
+              <w:t>user</w:t>
+            </w:r>
+          </w:p>
+        </w:tc>
+        <w:tc>
+          <w:tcPr>
+            <w:tcW w:type="dxa" w:w="3249"/>
+          </w:tcPr>
+          <w:p>
+            <w:r>
+              <w:t>email</w:t>
+            </w:r>
+          </w:p>
+        </w:tc>
+        <w:tc>
+          <w:tcPr>
+            <w:tcW w:type="dxa" w:w="3249"/>
+          </w:tcPr>
+          <w:p>
+            <w:r>
+              <w:t>Enrollment — participant identifier (PII)</w:t>
+            </w:r>
+          </w:p>
+        </w:tc>
+      </w:tr>
+      <w:tr>
+        <w:tc>
+          <w:tcPr>
+            <w:tcW w:type="dxa" w:w="3249"/>
+          </w:tcPr>
+          <w:p>
+            <w:r>
+              <w:t>user</w:t>
+            </w:r>
+          </w:p>
+        </w:tc>
+        <w:tc>
+          <w:tcPr>
+            <w:tcW w:type="dxa" w:w="3249"/>
+          </w:tcPr>
+          <w:p>
+            <w:r>
+              <w:t>first_name, last_name</w:t>
+            </w:r>
+          </w:p>
+        </w:tc>
+        <w:tc>
+          <w:tcPr>
+            <w:tcW w:type="dxa" w:w="3249"/>
+          </w:tcPr>
+          <w:p>
+            <w:r>
+              <w:t>Enrollment — participant identifier (PII)</w:t>
+            </w:r>
+          </w:p>
+        </w:tc>
+      </w:tr>
+      <w:tr>
+        <w:tc>
+          <w:tcPr>
+            <w:tcW w:type="dxa" w:w="3249"/>
+          </w:tcPr>
+          <w:p>
+            <w:r>
+              <w:t>user</w:t>
+            </w:r>
+          </w:p>
+        </w:tc>
+        <w:tc>
+          <w:tcPr>
+            <w:tcW w:type="dxa" w:w="3249"/>
+          </w:tcPr>
+          <w:p>
+            <w:r>
+              <w:t>birthdate, gender</w:t>
+            </w:r>
+          </w:p>
+        </w:tc>
+        <w:tc>
+          <w:tcPr>
+            <w:tcW w:type="dxa" w:w="3249"/>
+          </w:tcPr>
+          <w:p>
+            <w:r>
+              <w:t>Demographic covariates</w:t>
+            </w:r>
+          </w:p>
+        </w:tc>
+      </w:tr>
+      <w:tr>
+        <w:tc>
+          <w:tcPr>
+            <w:tcW w:type="dxa" w:w="3249"/>
+          </w:tcPr>
+          <w:p>
+            <w:r>
+              <w:t>user</w:t>
+            </w:r>
+          </w:p>
+        </w:tc>
+        <w:tc>
+          <w:tcPr>
+            <w:tcW w:type="dxa" w:w="3249"/>
+          </w:tcPr>
+          <w:p>
+            <w:r>
+              <w:t>password</w:t>
+            </w:r>
+          </w:p>
+        </w:tc>
+        <w:tc>
+          <w:tcPr>
+            <w:tcW w:type="dxa" w:w="3249"/>
+          </w:tcPr>
+          <w:p>
+            <w:r>
+              <w:t>Infrastructure — authentication</w:t>
+            </w:r>
+          </w:p>
+        </w:tc>
+      </w:tr>
+      <w:tr>
+        <w:tc>
+          <w:tcPr>
+            <w:tcW w:type="dxa" w:w="3249"/>
+          </w:tcPr>
+          <w:p>
+            <w:r>
+              <w:t>user</w:t>
+            </w:r>
+          </w:p>
+        </w:tc>
+        <w:tc>
+          <w:tcPr>
+            <w:tcW w:type="dxa" w:w="3249"/>
+          </w:tcPr>
+          <w:p>
+            <w:r>
+              <w:t>push_token</w:t>
+            </w:r>
+          </w:p>
+        </w:tc>
+        <w:tc>
+          <w:tcPr>
+            <w:tcW w:type="dxa" w:w="3249"/>
+          </w:tcPr>
+          <w:p>
+            <w:r>
+              <w:t>JITAI delivery — Expo notification routing</w:t>
+            </w:r>
+          </w:p>
+        </w:tc>
+      </w:tr>
+      <w:tr>
+        <w:tc>
+          <w:tcPr>
+            <w:tcW w:type="dxa" w:w="3249"/>
+          </w:tcPr>
+          <w:p>
+            <w:r>
+              <w:t>user</w:t>
+            </w:r>
+          </w:p>
+        </w:tc>
+        <w:tc>
+          <w:tcPr>
+            <w:tcW w:type="dxa" w:w="3249"/>
+          </w:tcPr>
+          <w:p>
+            <w:r>
+              <w:t>is_enrolled</w:t>
+            </w:r>
+          </w:p>
+        </w:tc>
+        <w:tc>
+          <w:tcPr>
+            <w:tcW w:type="dxa" w:w="3249"/>
+          </w:tcPr>
+          <w:p>
+            <w:r>
+              <w:t>Enrollment audit</w:t>
+            </w:r>
+          </w:p>
+        </w:tc>
+      </w:tr>
+      <w:tr>
+        <w:tc>
+          <w:tcPr>
+            <w:tcW w:type="dxa" w:w="3249"/>
+          </w:tcPr>
+          <w:p>
+            <w:r>
+              <w:t>user</w:t>
+            </w:r>
+          </w:p>
+        </w:tc>
+        <w:tc>
+          <w:tcPr>
+            <w:tcW w:type="dxa" w:w="3249"/>
+          </w:tcPr>
+          <w:p>
+            <w:r>
+              <w:t>enrolled_at</w:t>
+            </w:r>
+          </w:p>
+        </w:tc>
+        <w:tc>
+          <w:tcPr>
+            <w:tcW w:type="dxa" w:w="3249"/>
+          </w:tcPr>
+          <w:p>
+            <w:r>
+              <w:t>Enrollment audit — study entry timestamp</w:t>
+            </w:r>
+          </w:p>
+        </w:tc>
+      </w:tr>
+      <w:tr>
+        <w:tc>
+          <w:tcPr>
+            <w:tcW w:type="dxa" w:w="3249"/>
+          </w:tcPr>
+          <w:p>
+            <w:r>
+              <w:t>wearable_device</w:t>
+            </w:r>
+          </w:p>
+        </w:tc>
+        <w:tc>
+          <w:tcPr>
+            <w:tcW w:type="dxa" w:w="3249"/>
+          </w:tcPr>
+          <w:p>
+            <w:r>
+              <w:t>id</w:t>
+            </w:r>
+          </w:p>
+        </w:tc>
+        <w:tc>
+          <w:tcPr>
+            <w:tcW w:type="dxa" w:w="3249"/>
+          </w:tcPr>
+          <w:p>
+            <w:r>
+              <w:t>Infrastructure — primary key</w:t>
+            </w:r>
+          </w:p>
+        </w:tc>
+      </w:tr>
+      <w:tr>
+        <w:tc>
+          <w:tcPr>
+            <w:tcW w:type="dxa" w:w="3249"/>
+          </w:tcPr>
+          <w:p>
+            <w:r>
+              <w:t>wearable_device</w:t>
+            </w:r>
+          </w:p>
+        </w:tc>
+        <w:tc>
+          <w:tcPr>
+            <w:tcW w:type="dxa" w:w="3249"/>
+          </w:tcPr>
+          <w:p>
+            <w:r>
+              <w:t>user_id</w:t>
+            </w:r>
+          </w:p>
+        </w:tc>
+        <w:tc>
+          <w:tcPr>
+            <w:tcW w:type="dxa" w:w="3249"/>
+          </w:tcPr>
+          <w:p>
+            <w:r>
+              <w:t>Infrastructure — FK → user</w:t>
+            </w:r>
+          </w:p>
+        </w:tc>
+      </w:tr>
+      <w:tr>
+        <w:tc>
+          <w:tcPr>
+            <w:tcW w:type="dxa" w:w="3249"/>
+          </w:tcPr>
+          <w:p>
+            <w:r>
+              <w:t>wearable_device</w:t>
+            </w:r>
+          </w:p>
+        </w:tc>
+        <w:tc>
+          <w:tcPr>
+            <w:tcW w:type="dxa" w:w="3249"/>
+          </w:tcPr>
+          <w:p>
+            <w:r>
+              <w:t>labfront_participant_id</w:t>
+            </w:r>
+          </w:p>
+        </w:tc>
+        <w:tc>
+          <w:tcPr>
+            <w:tcW w:type="dxa" w:w="3249"/>
+          </w:tcPr>
+          <w:p>
+            <w:r>
+              <w:t>Data pipeline — Labfront API key per participant</w:t>
+            </w:r>
+          </w:p>
+        </w:tc>
+      </w:tr>
+      <w:tr>
+        <w:tc>
+          <w:tcPr>
+            <w:tcW w:type="dxa" w:w="3249"/>
+          </w:tcPr>
+          <w:p>
+            <w:r>
+              <w:t>wearable_device</w:t>
+            </w:r>
+          </w:p>
+        </w:tc>
+        <w:tc>
+          <w:tcPr>
+            <w:tcW w:type="dxa" w:w="3249"/>
+          </w:tcPr>
+          <w:p>
+            <w:r>
+              <w:t>is_active</w:t>
+            </w:r>
+          </w:p>
+        </w:tc>
+        <w:tc>
+          <w:tcPr>
+            <w:tcW w:type="dxa" w:w="3249"/>
+          </w:tcPr>
+          <w:p>
+            <w:r>
+              <w:t>Device compliance monitoring</w:t>
+            </w:r>
+          </w:p>
+        </w:tc>
+      </w:tr>
+      <w:tr>
+        <w:tc>
+          <w:tcPr>
+            <w:tcW w:type="dxa" w:w="3249"/>
+          </w:tcPr>
+          <w:p>
+            <w:r>
+              <w:t>wearable_device</w:t>
+            </w:r>
+          </w:p>
+        </w:tc>
+        <w:tc>
+          <w:tcPr>
+            <w:tcW w:type="dxa" w:w="3249"/>
+          </w:tcPr>
+          <w:p>
+            <w:r>
+              <w:t>last_synced_at</w:t>
+            </w:r>
+          </w:p>
+        </w:tc>
+        <w:tc>
+          <w:tcPr>
+            <w:tcW w:type="dxa" w:w="3249"/>
+          </w:tcPr>
+          <w:p>
+            <w:r>
+              <w:t>Device compliance monitoring</w:t>
+            </w:r>
+          </w:p>
+        </w:tc>
+      </w:tr>
+      <w:tr>
+        <w:tc>
+          <w:tcPr>
+            <w:tcW w:type="dxa" w:w="3249"/>
+          </w:tcPr>
+          <w:p>
+            <w:r>
+              <w:t>heart_rate_sample</w:t>
+            </w:r>
+          </w:p>
+        </w:tc>
+        <w:tc>
+          <w:tcPr>
+            <w:tcW w:type="dxa" w:w="3249"/>
+          </w:tcPr>
+          <w:p>
+            <w:r>
+              <w:t>id</w:t>
+            </w:r>
+          </w:p>
+        </w:tc>
+        <w:tc>
+          <w:tcPr>
+            <w:tcW w:type="dxa" w:w="3249"/>
+          </w:tcPr>
+          <w:p>
+            <w:r>
+              <w:t>Infrastructure — primary key</w:t>
+            </w:r>
+          </w:p>
+        </w:tc>
+      </w:tr>
+      <w:tr>
+        <w:tc>
+          <w:tcPr>
+            <w:tcW w:type="dxa" w:w="3249"/>
+          </w:tcPr>
+          <w:p>
+            <w:r>
+              <w:t>heart_rate_sample</w:t>
+            </w:r>
+          </w:p>
+        </w:tc>
+        <w:tc>
+          <w:tcPr>
+            <w:tcW w:type="dxa" w:w="3249"/>
+          </w:tcPr>
+          <w:p>
+            <w:r>
+              <w:t>user_id</w:t>
+            </w:r>
+          </w:p>
+        </w:tc>
+        <w:tc>
+          <w:tcPr>
+            <w:tcW w:type="dxa" w:w="3249"/>
+          </w:tcPr>
+          <w:p>
+            <w:r>
+              <w:t>Infrastructure — FK → user</w:t>
+            </w:r>
+          </w:p>
+        </w:tc>
+      </w:tr>
+      <w:tr>
+        <w:tc>
+          <w:tcPr>
+            <w:tcW w:type="dxa" w:w="3249"/>
+          </w:tcPr>
+          <w:p>
+            <w:r>
+              <w:t>heart_rate_sample</w:t>
+            </w:r>
+          </w:p>
+        </w:tc>
+        <w:tc>
+          <w:tcPr>
+            <w:tcW w:type="dxa" w:w="3249"/>
+          </w:tcPr>
+          <w:p>
+            <w:r>
+              <w:t>timestamp</w:t>
+            </w:r>
+          </w:p>
+        </w:tc>
+        <w:tc>
+          <w:tcPr>
+            <w:tcW w:type="dxa" w:w="3249"/>
+          </w:tcPr>
+          <w:p>
+            <w:r>
+              <w:t>Data provenance — when the sample was recorded</w:t>
+            </w:r>
+          </w:p>
+        </w:tc>
+      </w:tr>
+      <w:tr>
+        <w:tc>
+          <w:tcPr>
+            <w:tcW w:type="dxa" w:w="3249"/>
+          </w:tcPr>
+          <w:p>
+            <w:r>
+              <w:t>heart_rate_sample</w:t>
+            </w:r>
+          </w:p>
+        </w:tc>
+        <w:tc>
+          <w:tcPr>
+            <w:tcW w:type="dxa" w:w="3249"/>
+          </w:tcPr>
+          <w:p>
+            <w:r>
+              <w:t>bpm</w:t>
+            </w:r>
+          </w:p>
+        </w:tc>
+        <w:tc>
+          <w:tcPr>
+            <w:tcW w:type="dxa" w:w="3249"/>
+          </w:tcPr>
+          <w:p>
+            <w:r>
+              <w:t>JITAI decision — HR trigger signal</w:t>
+            </w:r>
+          </w:p>
+        </w:tc>
+      </w:tr>
+      <w:tr>
+        <w:tc>
+          <w:tcPr>
+            <w:tcW w:type="dxa" w:w="3249"/>
+          </w:tcPr>
+          <w:p>
+            <w:r>
+              <w:t>heart_rate_sample</w:t>
+            </w:r>
+          </w:p>
+        </w:tc>
+        <w:tc>
+          <w:tcPr>
+            <w:tcW w:type="dxa" w:w="3249"/>
+          </w:tcPr>
+          <w:p>
+            <w:r>
+              <w:t>source</w:t>
+            </w:r>
+          </w:p>
+        </w:tc>
+        <w:tc>
+          <w:tcPr>
+            <w:tcW w:type="dxa" w:w="3249"/>
+          </w:tcPr>
+          <w:p>
+            <w:r>
+              <w:t>Data provenance — default: garmin_labfront</w:t>
+            </w:r>
+          </w:p>
+        </w:tc>
+      </w:tr>
+      <w:tr>
+        <w:tc>
+          <w:tcPr>
+            <w:tcW w:type="dxa" w:w="3249"/>
+          </w:tcPr>
+          <w:p>
+            <w:r>
+              <w:t>stress_sample</w:t>
+            </w:r>
+          </w:p>
+        </w:tc>
+        <w:tc>
+          <w:tcPr>
+            <w:tcW w:type="dxa" w:w="3249"/>
+          </w:tcPr>
+          <w:p>
+            <w:r>
+              <w:t>id</w:t>
+            </w:r>
+          </w:p>
+        </w:tc>
+        <w:tc>
+          <w:tcPr>
+            <w:tcW w:type="dxa" w:w="3249"/>
+          </w:tcPr>
+          <w:p>
+            <w:r>
+              <w:t>Infrastructure — primary key</w:t>
+            </w:r>
+          </w:p>
+        </w:tc>
+      </w:tr>
+      <w:tr>
+        <w:tc>
+          <w:tcPr>
+            <w:tcW w:type="dxa" w:w="3249"/>
+          </w:tcPr>
+          <w:p>
+            <w:r>
+              <w:t>stress_sample</w:t>
+            </w:r>
+          </w:p>
+        </w:tc>
+        <w:tc>
+          <w:tcPr>
+            <w:tcW w:type="dxa" w:w="3249"/>
+          </w:tcPr>
+          <w:p>
+            <w:r>
+              <w:t>user_id</w:t>
+            </w:r>
+          </w:p>
+        </w:tc>
+        <w:tc>
+          <w:tcPr>
+            <w:tcW w:type="dxa" w:w="3249"/>
+          </w:tcPr>
+          <w:p>
+            <w:r>
+              <w:t>Infrastructure — FK → user</w:t>
+            </w:r>
+          </w:p>
+        </w:tc>
+      </w:tr>
+      <w:tr>
+        <w:tc>
+          <w:tcPr>
+            <w:tcW w:type="dxa" w:w="3249"/>
+          </w:tcPr>
+          <w:p>
+            <w:r>
+              <w:t>stress_sample</w:t>
+            </w:r>
+          </w:p>
+        </w:tc>
+        <w:tc>
+          <w:tcPr>
+            <w:tcW w:type="dxa" w:w="3249"/>
+          </w:tcPr>
+          <w:p>
+            <w:r>
+              <w:t>timestamp</w:t>
+            </w:r>
+          </w:p>
+        </w:tc>
+        <w:tc>
+          <w:tcPr>
+            <w:tcW w:type="dxa" w:w="3249"/>
+          </w:tcPr>
+          <w:p>
+            <w:r>
+              <w:t>Data provenance</w:t>
+            </w:r>
+          </w:p>
+        </w:tc>
+      </w:tr>
+      <w:tr>
+        <w:tc>
+          <w:tcPr>
+            <w:tcW w:type="dxa" w:w="3249"/>
+          </w:tcPr>
+          <w:p>
+            <w:r>
+              <w:t>stress_sample</w:t>
+            </w:r>
+          </w:p>
+        </w:tc>
+        <w:tc>
+          <w:tcPr>
+            <w:tcW w:type="dxa" w:w="3249"/>
+          </w:tcPr>
+          <w:p>
+            <w:r>
+              <w:t>stress_score</w:t>
+            </w:r>
+          </w:p>
+        </w:tc>
+        <w:tc>
+          <w:tcPr>
+            <w:tcW w:type="dxa" w:w="3249"/>
+          </w:tcPr>
+          <w:p>
+            <w:r>
+              <w:t>JITAI decision — Garmin stress trigger signal (0–100)</w:t>
+            </w:r>
+          </w:p>
+        </w:tc>
+      </w:tr>
+      <w:tr>
+        <w:tc>
+          <w:tcPr>
+            <w:tcW w:type="dxa" w:w="3249"/>
+          </w:tcPr>
+          <w:p>
+            <w:r>
+              <w:t>stress_sample</w:t>
+            </w:r>
+          </w:p>
+        </w:tc>
+        <w:tc>
+          <w:tcPr>
+            <w:tcW w:type="dxa" w:w="3249"/>
+          </w:tcPr>
+          <w:p>
+            <w:r>
+              <w:t>source</w:t>
+            </w:r>
+          </w:p>
+        </w:tc>
+        <w:tc>
+          <w:tcPr>
+            <w:tcW w:type="dxa" w:w="3249"/>
+          </w:tcPr>
+          <w:p>
+            <w:r>
+              <w:t>Data provenance</w:t>
+            </w:r>
+          </w:p>
+        </w:tc>
+      </w:tr>
+      <w:tr>
+        <w:tc>
+          <w:tcPr>
+            <w:tcW w:type="dxa" w:w="3249"/>
+          </w:tcPr>
+          <w:p>
+            <w:r>
+              <w:t>ema</w:t>
+            </w:r>
+          </w:p>
+        </w:tc>
+        <w:tc>
+          <w:tcPr>
+            <w:tcW w:type="dxa" w:w="3249"/>
+          </w:tcPr>
+          <w:p>
+            <w:r>
+              <w:t>id</w:t>
+            </w:r>
+          </w:p>
+        </w:tc>
+        <w:tc>
+          <w:tcPr>
+            <w:tcW w:type="dxa" w:w="3249"/>
+          </w:tcPr>
+          <w:p>
+            <w:r>
+              <w:t>Infrastructure — primary key</w:t>
+            </w:r>
+          </w:p>
+        </w:tc>
+      </w:tr>
+      <w:tr>
+        <w:tc>
+          <w:tcPr>
+            <w:tcW w:type="dxa" w:w="3249"/>
+          </w:tcPr>
+          <w:p>
+            <w:r>
+              <w:t>ema</w:t>
+            </w:r>
+          </w:p>
+        </w:tc>
+        <w:tc>
+          <w:tcPr>
+            <w:tcW w:type="dxa" w:w="3249"/>
+          </w:tcPr>
+          <w:p>
+            <w:r>
+              <w:t>user_id</w:t>
+            </w:r>
+          </w:p>
+        </w:tc>
+        <w:tc>
+          <w:tcPr>
+            <w:tcW w:type="dxa" w:w="3249"/>
+          </w:tcPr>
+          <w:p>
+            <w:r>
+              <w:t>Infrastructure — FK → user</w:t>
+            </w:r>
+          </w:p>
+        </w:tc>
+      </w:tr>
+      <w:tr>
+        <w:tc>
+          <w:tcPr>
+            <w:tcW w:type="dxa" w:w="3249"/>
+          </w:tcPr>
+          <w:p>
+            <w:r>
+              <w:t>ema</w:t>
+            </w:r>
+          </w:p>
+        </w:tc>
+        <w:tc>
+          <w:tcPr>
+            <w:tcW w:type="dxa" w:w="3249"/>
+          </w:tcPr>
+          <w:p>
+            <w:r>
+              <w:t>prompt_id</w:t>
+            </w:r>
+          </w:p>
+        </w:tc>
+        <w:tc>
+          <w:tcPr>
+            <w:tcW w:type="dxa" w:w="3249"/>
+          </w:tcPr>
+          <w:p>
+            <w:r>
+              <w:t>JITAI delivery — template reference (never message text)</w:t>
+            </w:r>
+          </w:p>
+        </w:tc>
+      </w:tr>
+      <w:tr>
+        <w:tc>
+          <w:tcPr>
+            <w:tcW w:type="dxa" w:w="3249"/>
+          </w:tcPr>
+          <w:p>
+            <w:r>
+              <w:t>ema</w:t>
+            </w:r>
+          </w:p>
+        </w:tc>
+        <w:tc>
+          <w:tcPr>
+            <w:tcW w:type="dxa" w:w="3249"/>
+          </w:tcPr>
+          <w:p>
+            <w:r>
+              <w:t>sent_at</w:t>
+            </w:r>
+          </w:p>
+        </w:tc>
+        <w:tc>
+          <w:tcPr>
+            <w:tcW w:type="dxa" w:w="3249"/>
+          </w:tcPr>
+          <w:p>
+            <w:r>
+              <w:t>JITAI delivery audit — when prompt was dispatched</w:t>
+            </w:r>
+          </w:p>
+        </w:tc>
+      </w:tr>
+      <w:tr>
+        <w:tc>
+          <w:tcPr>
+            <w:tcW w:type="dxa" w:w="3249"/>
+          </w:tcPr>
+          <w:p>
+            <w:r>
+              <w:t>ema</w:t>
+            </w:r>
+          </w:p>
+        </w:tc>
+        <w:tc>
+          <w:tcPr>
+            <w:tcW w:type="dxa" w:w="3249"/>
+          </w:tcPr>
+          <w:p>
+            <w:r>
+              <w:t>responded_at</w:t>
+            </w:r>
+          </w:p>
+        </w:tc>
+        <w:tc>
+          <w:tcPr>
+            <w:tcW w:type="dxa" w:w="3249"/>
+          </w:tcPr>
+          <w:p>
+            <w:r>
+              <w:t>JITAI delivery audit — response latency input</w:t>
+            </w:r>
+          </w:p>
+        </w:tc>
+      </w:tr>
+      <w:tr>
+        <w:tc>
+          <w:tcPr>
+            <w:tcW w:type="dxa" w:w="3249"/>
+          </w:tcPr>
+          <w:p>
+            <w:r>
+              <w:t>ema</w:t>
+            </w:r>
+          </w:p>
+        </w:tc>
+        <w:tc>
+          <w:tcPr>
+            <w:tcW w:type="dxa" w:w="3249"/>
+          </w:tcPr>
+          <w:p>
+            <w:r>
+              <w:t>status</w:t>
+            </w:r>
+          </w:p>
+        </w:tc>
+        <w:tc>
+          <w:tcPr>
+            <w:tcW w:type="dxa" w:w="3249"/>
+          </w:tcPr>
+          <w:p>
+            <w:r>
+              <w:t>JITAI delivery audit — pending / completed / expired</w:t>
+            </w:r>
+          </w:p>
+        </w:tc>
+      </w:tr>
+      <w:tr>
+        <w:tc>
+          <w:tcPr>
+            <w:tcW w:type="dxa" w:w="3249"/>
+          </w:tcPr>
+          <w:p>
+            <w:r>
+              <w:t>ema</w:t>
+            </w:r>
+          </w:p>
+        </w:tc>
+        <w:tc>
+          <w:tcPr>
+            <w:tcW w:type="dxa" w:w="3249"/>
+          </w:tcPr>
+          <w:p>
+            <w:r>
+              <w:t>mood</w:t>
+            </w:r>
+          </w:p>
+        </w:tc>
+        <w:tc>
+          <w:tcPr>
+            <w:tcW w:type="dxa" w:w="3249"/>
+          </w:tcPr>
+          <w:p>
+            <w:r>
+              <w:t>EMA volatility — MSSD input (1–7 Likert)</w:t>
+            </w:r>
+          </w:p>
+        </w:tc>
+      </w:tr>
+      <w:tr>
+        <w:tc>
+          <w:tcPr>
+            <w:tcW w:type="dxa" w:w="3249"/>
+          </w:tcPr>
+          <w:p>
+            <w:r>
+              <w:t>ema</w:t>
+            </w:r>
+          </w:p>
+        </w:tc>
+        <w:tc>
+          <w:tcPr>
+            <w:tcW w:type="dxa" w:w="3249"/>
+          </w:tcPr>
+          <w:p>
+            <w:r>
+              <w:t>stress</w:t>
+            </w:r>
+          </w:p>
+        </w:tc>
+        <w:tc>
+          <w:tcPr>
+            <w:tcW w:type="dxa" w:w="3249"/>
+          </w:tcPr>
+          <w:p>
+            <w:r>
+              <w:t>EMA volatility — MSSD input (1–7 Likert)</w:t>
+            </w:r>
+          </w:p>
+        </w:tc>
+      </w:tr>
+      <w:tr>
+        <w:tc>
+          <w:tcPr>
+            <w:tcW w:type="dxa" w:w="3249"/>
+          </w:tcPr>
+          <w:p>
+            <w:r>
+              <w:t>ema</w:t>
+            </w:r>
+          </w:p>
+        </w:tc>
+        <w:tc>
+          <w:tcPr>
+            <w:tcW w:type="dxa" w:w="3249"/>
+          </w:tcPr>
+          <w:p>
+            <w:r>
+              <w:t>energy</w:t>
+            </w:r>
+          </w:p>
+        </w:tc>
+        <w:tc>
+          <w:tcPr>
+            <w:tcW w:type="dxa" w:w="3249"/>
+          </w:tcPr>
+          <w:p>
+            <w:r>
+              <w:t>EMA volatility — MSSD input (1–7 Likert)</w:t>
+            </w:r>
+          </w:p>
+        </w:tc>
+      </w:tr>
+      <w:tr>
+        <w:tc>
+          <w:tcPr>
+            <w:tcW w:type="dxa" w:w="3249"/>
+          </w:tcPr>
+          <w:p>
+            <w:r>
+              <w:t>jitai_log</w:t>
+            </w:r>
+          </w:p>
+        </w:tc>
+        <w:tc>
+          <w:tcPr>
+            <w:tcW w:type="dxa" w:w="3249"/>
+          </w:tcPr>
+          <w:p>
+            <w:r>
+              <w:t>id</w:t>
+            </w:r>
+          </w:p>
+        </w:tc>
+        <w:tc>
+          <w:tcPr>
+            <w:tcW w:type="dxa" w:w="3249"/>
+          </w:tcPr>
+          <w:p>
+            <w:r>
+              <w:t>Infrastructure — primary key</w:t>
+            </w:r>
+          </w:p>
+        </w:tc>
+      </w:tr>
+      <w:tr>
+        <w:tc>
+          <w:tcPr>
+            <w:tcW w:type="dxa" w:w="3249"/>
+          </w:tcPr>
+          <w:p>
+            <w:r>
+              <w:t>jitai_log</w:t>
+            </w:r>
+          </w:p>
+        </w:tc>
+        <w:tc>
+          <w:tcPr>
+            <w:tcW w:type="dxa" w:w="3249"/>
+          </w:tcPr>
+          <w:p>
+            <w:r>
+              <w:t>user_id</w:t>
+            </w:r>
+          </w:p>
+        </w:tc>
+        <w:tc>
+          <w:tcPr>
+            <w:tcW w:type="dxa" w:w="3249"/>
+          </w:tcPr>
+          <w:p>
+            <w:r>
+              <w:t>Infrastructure — FK → user</w:t>
+            </w:r>
+          </w:p>
+        </w:tc>
+      </w:tr>
+      <w:tr>
+        <w:tc>
+          <w:tcPr>
+            <w:tcW w:type="dxa" w:w="3249"/>
+          </w:tcPr>
+          <w:p>
+            <w:r>
+              <w:t>jitai_log</w:t>
+            </w:r>
+          </w:p>
+        </w:tc>
+        <w:tc>
+          <w:tcPr>
+            <w:tcW w:type="dxa" w:w="3249"/>
+          </w:tcPr>
+          <w:p>
+            <w:r>
+              <w:t>prompt_id</w:t>
+            </w:r>
+          </w:p>
+        </w:tc>
+        <w:tc>
+          <w:tcPr>
+            <w:tcW w:type="dxa" w:w="3249"/>
+          </w:tcPr>
+          <w:p>
+            <w:r>
+              <w:t>JITAI delivery — template reference (IRB: no message text stored)</w:t>
+            </w:r>
+          </w:p>
+        </w:tc>
+      </w:tr>
+      <w:tr>
+        <w:tc>
+          <w:tcPr>
+            <w:tcW w:type="dxa" w:w="3249"/>
+          </w:tcPr>
+          <w:p>
+            <w:r>
+              <w:t>jitai_log</w:t>
+            </w:r>
+          </w:p>
+        </w:tc>
+        <w:tc>
+          <w:tcPr>
+            <w:tcW w:type="dxa" w:w="3249"/>
+          </w:tcPr>
+          <w:p>
+            <w:r>
+              <w:t>triggered_at</w:t>
+            </w:r>
+          </w:p>
+        </w:tc>
+        <w:tc>
+          <w:tcPr>
+            <w:tcW w:type="dxa" w:w="3249"/>
+          </w:tcPr>
+          <w:p>
+            <w:r>
+              <w:t>MRT — decision point timestamp</w:t>
+            </w:r>
+          </w:p>
+        </w:tc>
+      </w:tr>
+      <w:tr>
+        <w:tc>
+          <w:tcPr>
+            <w:tcW w:type="dxa" w:w="3249"/>
+          </w:tcPr>
+          <w:p>
+            <w:r>
+              <w:t>jitai_log</w:t>
+            </w:r>
+          </w:p>
+        </w:tc>
+        <w:tc>
+          <w:tcPr>
+            <w:tcW w:type="dxa" w:w="3249"/>
+          </w:tcPr>
+          <w:p>
+            <w:r>
+              <w:t>trigger_reason</w:t>
+            </w:r>
+          </w:p>
+        </w:tc>
+        <w:tc>
+          <w:tcPr>
+            <w:tcW w:type="dxa" w:w="3249"/>
+          </w:tcPr>
+          <w:p>
+            <w:r>
+              <w:t>JITAI decision — signal audit string (e.g. hr_elevated+stress_high)</w:t>
+            </w:r>
+          </w:p>
+        </w:tc>
+      </w:tr>
+      <w:tr>
+        <w:tc>
+          <w:tcPr>
+            <w:tcW w:type="dxa" w:w="3249"/>
+          </w:tcPr>
+          <w:p>
+            <w:r>
+              <w:t>jitai_log</w:t>
+            </w:r>
+          </w:p>
+        </w:tc>
+        <w:tc>
+          <w:tcPr>
+            <w:tcW w:type="dxa" w:w="3249"/>
+          </w:tcPr>
+          <w:p>
+            <w:r>
+              <w:t>hr_at_trigger</w:t>
+            </w:r>
+          </w:p>
+        </w:tc>
+        <w:tc>
+          <w:tcPr>
+            <w:tcW w:type="dxa" w:w="3249"/>
+          </w:tcPr>
+          <w:p>
+            <w:r>
+              <w:t>JITAI decision — HR snapshot at decision point</w:t>
+            </w:r>
+          </w:p>
+        </w:tc>
+      </w:tr>
+      <w:tr>
+        <w:tc>
+          <w:tcPr>
+            <w:tcW w:type="dxa" w:w="3249"/>
+          </w:tcPr>
+          <w:p>
+            <w:r>
+              <w:t>jitai_log</w:t>
+            </w:r>
+          </w:p>
+        </w:tc>
+        <w:tc>
+          <w:tcPr>
+            <w:tcW w:type="dxa" w:w="3249"/>
+          </w:tcPr>
+          <w:p>
+            <w:r>
+              <w:t>stress_at_trigger</w:t>
+            </w:r>
+          </w:p>
+        </w:tc>
+        <w:tc>
+          <w:tcPr>
+            <w:tcW w:type="dxa" w:w="3249"/>
+          </w:tcPr>
+          <w:p>
+            <w:r>
+              <w:t>JITAI decision — Garmin stress snapshot at decision point</w:t>
+            </w:r>
+          </w:p>
+        </w:tc>
+      </w:tr>
+      <w:tr>
+        <w:tc>
+          <w:tcPr>
+            <w:tcW w:type="dxa" w:w="3249"/>
+          </w:tcPr>
+          <w:p>
+            <w:r>
+              <w:t>jitai_log</w:t>
+            </w:r>
+          </w:p>
+        </w:tc>
+        <w:tc>
+          <w:tcPr>
+            <w:tcW w:type="dxa" w:w="3249"/>
+          </w:tcPr>
+          <w:p>
+            <w:r>
+              <w:t>ema_id</w:t>
+            </w:r>
+          </w:p>
+        </w:tc>
+        <w:tc>
+          <w:tcPr>
+            <w:tcW w:type="dxa" w:w="3249"/>
+          </w:tcPr>
+          <w:p>
+            <w:r>
+              <w:t>JITAI decision — FK → EMA that drove the decision (nullable)</w:t>
+            </w:r>
+          </w:p>
+        </w:tc>
+      </w:tr>
+      <w:tr>
+        <w:tc>
+          <w:tcPr>
+            <w:tcW w:type="dxa" w:w="3249"/>
+          </w:tcPr>
+          <w:p>
+            <w:r>
+              <w:t>jitai_log</w:t>
+            </w:r>
+          </w:p>
+        </w:tc>
+        <w:tc>
+          <w:tcPr>
+            <w:tcW w:type="dxa" w:w="3249"/>
+          </w:tcPr>
+          <w:p>
+            <w:r>
+              <w:t>observed_mssd</w:t>
+            </w:r>
+          </w:p>
+        </w:tc>
+        <w:tc>
+          <w:tcPr>
+            <w:tcW w:type="dxa" w:w="3249"/>
+          </w:tcPr>
+          <w:p>
+            <w:r>
+              <w:t>EMA volatility — MSSD score at decision point</w:t>
+            </w:r>
+          </w:p>
+        </w:tc>
+      </w:tr>
+      <w:tr>
+        <w:tc>
+          <w:tcPr>
+            <w:tcW w:type="dxa" w:w="3249"/>
+          </w:tcPr>
+          <w:p>
+            <w:r>
+              <w:t>jitai_log</w:t>
+            </w:r>
+          </w:p>
+        </w:tc>
+        <w:tc>
+          <w:tcPr>
+            <w:tcW w:type="dxa" w:w="3249"/>
+          </w:tcPr>
+          <w:p>
+            <w:r>
+              <w:t>send_prompt</w:t>
+            </w:r>
+          </w:p>
+        </w:tc>
+        <w:tc>
+          <w:tcPr>
+            <w:tcW w:type="dxa" w:w="3249"/>
+          </w:tcPr>
+          <w:p>
+            <w:r>
+              <w:t>MRT — treatment assignment: True = intervention arm, False = control</w:t>
+            </w:r>
+          </w:p>
+        </w:tc>
+      </w:tr>
+      <w:tr>
+        <w:tc>
+          <w:tcPr>
+            <w:tcW w:type="dxa" w:w="3249"/>
+          </w:tcPr>
+          <w:p>
+            <w:r>
+              <w:t>jitai_log</w:t>
+            </w:r>
+          </w:p>
+        </w:tc>
+        <w:tc>
+          <w:tcPr>
+            <w:tcW w:type="dxa" w:w="3249"/>
+          </w:tcPr>
+          <w:p>
+            <w:r>
+              <w:t>status</w:t>
+            </w:r>
+          </w:p>
+        </w:tc>
+        <w:tc>
+          <w:tcPr>
+            <w:tcW w:type="dxa" w:w="3249"/>
+          </w:tcPr>
+          <w:p>
+            <w:r>
+              <w:t>JITAI delivery audit — delivered / opened / interacted / failed</w:t>
+            </w:r>
+          </w:p>
+        </w:tc>
+      </w:tr>
+      <w:tr>
+        <w:tc>
+          <w:tcPr>
+            <w:tcW w:type="dxa" w:w="3249"/>
+          </w:tcPr>
+          <w:p>
+            <w:r>
+              <w:t>jitai_log</w:t>
+            </w:r>
+          </w:p>
+        </w:tc>
+        <w:tc>
+          <w:tcPr>
+            <w:tcW w:type="dxa" w:w="3249"/>
+          </w:tcPr>
+          <w:p>
+            <w:r>
+              <w:t>randomization_draw</w:t>
+            </w:r>
+          </w:p>
+        </w:tc>
+        <w:tc>
+          <w:tcPr>
+            <w:tcW w:type="dxa" w:w="3249"/>
+          </w:tcPr>
+          <w:p>
+            <w:r>
+              <w:t>MRT — Uniform(0,1) draw; with p enables causal analysis</w:t>
+            </w:r>
+          </w:p>
+        </w:tc>
+      </w:tr>
+      <w:tr>
+        <w:tc>
+          <w:tcPr>
+            <w:tcW w:type="dxa" w:w="3249"/>
+          </w:tcPr>
+          <w:p>
+            <w:r>
+              <w:t>jitai_log</w:t>
+            </w:r>
+          </w:p>
+        </w:tc>
+        <w:tc>
+          <w:tcPr>
+            <w:tcW w:type="dxa" w:w="3249"/>
+          </w:tcPr>
+          <w:p>
+            <w:r>
+              <w:t>randomization_probability</w:t>
+            </w:r>
+          </w:p>
+        </w:tc>
+        <w:tc>
+          <w:tcPr>
+            <w:tcW w:type="dxa" w:w="3249"/>
+          </w:tcPr>
+          <w:p>
+            <w:r>
+              <w:t>MRT — p value used at this decision point (fixed 0.5 for pilot)</w:t>
+            </w:r>
+          </w:p>
+        </w:tc>
+      </w:tr>
+      <w:tr>
+        <w:tc>
+          <w:tcPr>
+            <w:tcW w:type="dxa" w:w="3249"/>
+          </w:tcPr>
+          <w:p>
+            <w:r>
+              <w:t>jitai_log</w:t>
+            </w:r>
+          </w:p>
+        </w:tc>
+        <w:tc>
+          <w:tcPr>
+            <w:tcW w:type="dxa" w:w="3249"/>
+          </w:tcPr>
+          <w:p>
+            <w:r>
+              <w:t>decision_point_id</w:t>
+            </w:r>
+          </w:p>
+        </w:tc>
+        <w:tc>
+          <w:tcPr>
+            <w:tcW w:type="dxa" w:w="3249"/>
+          </w:tcPr>
+          <w:p>
+            <w:r>
+              <w:t>MRT — idempotency key ensuring one log row per EMA decision point</w:t>
+            </w:r>
+          </w:p>
+        </w:tc>
+      </w:tr>
+      <w:tr>
+        <w:tc>
+          <w:tcPr>
+            <w:tcW w:type="dxa" w:w="3249"/>
+          </w:tcPr>
+          <w:p>
+            <w:r>
+              <w:t>phone_telemetry</w:t>
+            </w:r>
+          </w:p>
+        </w:tc>
+        <w:tc>
+          <w:tcPr>
+            <w:tcW w:type="dxa" w:w="3249"/>
+          </w:tcPr>
+          <w:p>
+            <w:r>
+              <w:t>id</w:t>
+            </w:r>
+          </w:p>
+        </w:tc>
+        <w:tc>
+          <w:tcPr>
+            <w:tcW w:type="dxa" w:w="3249"/>
+          </w:tcPr>
+          <w:p>
+            <w:r>
+              <w:t>Infrastructure — primary key</w:t>
+            </w:r>
+          </w:p>
+        </w:tc>
+      </w:tr>
+      <w:tr>
+        <w:tc>
+          <w:tcPr>
+            <w:tcW w:type="dxa" w:w="3249"/>
+          </w:tcPr>
+          <w:p>
+            <w:r>
+              <w:t>phone_telemetry</w:t>
+            </w:r>
+          </w:p>
+        </w:tc>
+        <w:tc>
+          <w:tcPr>
+            <w:tcW w:type="dxa" w:w="3249"/>
+          </w:tcPr>
+          <w:p>
+            <w:r>
+              <w:t>user_id</w:t>
+            </w:r>
+          </w:p>
+        </w:tc>
+        <w:tc>
+          <w:tcPr>
+            <w:tcW w:type="dxa" w:w="3249"/>
+          </w:tcPr>
+          <w:p>
+            <w:r>
+              <w:t>Infrastructure — FK → user</w:t>
+            </w:r>
+          </w:p>
+        </w:tc>
+      </w:tr>
+      <w:tr>
+        <w:tc>
+          <w:tcPr>
+            <w:tcW w:type="dxa" w:w="3249"/>
+          </w:tcPr>
+          <w:p>
+            <w:r>
+              <w:t>phone_telemetry</w:t>
+            </w:r>
+          </w:p>
+        </w:tc>
+        <w:tc>
+          <w:tcPr>
+            <w:tcW w:type="dxa" w:w="3249"/>
+          </w:tcPr>
+          <w:p>
+            <w:r>
+              <w:t>session_id</w:t>
+            </w:r>
+          </w:p>
+        </w:tc>
+        <w:tc>
+          <w:tcPr>
+            <w:tcW w:type="dxa" w:w="3249"/>
+          </w:tcPr>
+          <w:p>
+            <w:r>
+              <w:t>Data provenance — groups events within one app session</w:t>
+            </w:r>
+          </w:p>
+        </w:tc>
+      </w:tr>
+      <w:tr>
+        <w:tc>
+          <w:tcPr>
+            <w:tcW w:type="dxa" w:w="3249"/>
+          </w:tcPr>
+          <w:p>
+            <w:r>
+              <w:t>phone_telemetry</w:t>
+            </w:r>
+          </w:p>
+        </w:tc>
+        <w:tc>
+          <w:tcPr>
+            <w:tcW w:type="dxa" w:w="3249"/>
+          </w:tcPr>
+          <w:p>
+            <w:r>
+              <w:t>event_type</w:t>
+            </w:r>
+          </w:p>
+        </w:tc>
+        <w:tc>
+          <w:tcPr>
+            <w:tcW w:type="dxa" w:w="3249"/>
+          </w:tcPr>
+          <w:p>
+            <w:r>
+              <w:t>Cyber aggression telemetry — compose/navigation event type</w:t>
+            </w:r>
+          </w:p>
+        </w:tc>
+      </w:tr>
+      <w:tr>
+        <w:tc>
+          <w:tcPr>
+            <w:tcW w:type="dxa" w:w="3249"/>
+          </w:tcPr>
+          <w:p>
+            <w:r>
+              <w:t>phone_telemetry</w:t>
+            </w:r>
+          </w:p>
+        </w:tc>
+        <w:tc>
+          <w:tcPr>
+            <w:tcW w:type="dxa" w:w="3249"/>
+          </w:tcPr>
+          <w:p>
+            <w:r>
+              <w:t>occurred_at</w:t>
+            </w:r>
+          </w:p>
+        </w:tc>
+        <w:tc>
+          <w:tcPr>
+            <w:tcW w:type="dxa" w:w="3249"/>
+          </w:tcPr>
+          <w:p>
+            <w:r>
+              <w:t>Data provenance — client-side event timestamp</w:t>
+            </w:r>
+          </w:p>
+        </w:tc>
+      </w:tr>
+      <w:tr>
+        <w:tc>
+          <w:tcPr>
+            <w:tcW w:type="dxa" w:w="3249"/>
+          </w:tcPr>
+          <w:p>
+            <w:r>
+              <w:t>phone_telemetry</w:t>
+            </w:r>
+          </w:p>
+        </w:tc>
+        <w:tc>
+          <w:tcPr>
+            <w:tcW w:type="dxa" w:w="3249"/>
+          </w:tcPr>
+          <w:p>
+            <w:r>
+              <w:t>recorded_at</w:t>
+            </w:r>
+          </w:p>
+        </w:tc>
+        <w:tc>
+          <w:tcPr>
+            <w:tcW w:type="dxa" w:w="3249"/>
+          </w:tcPr>
+          <w:p>
+            <w:r>
+              <w:t>Data provenance — server receipt timestamp</w:t>
+            </w:r>
+          </w:p>
+        </w:tc>
+      </w:tr>
+      <w:tr>
+        <w:tc>
+          <w:tcPr>
+            <w:tcW w:type="dxa" w:w="3249"/>
+          </w:tcPr>
+          <w:p>
+            <w:r>
+              <w:t>phone_telemetry</w:t>
+            </w:r>
+          </w:p>
+        </w:tc>
+        <w:tc>
+          <w:tcPr>
+            <w:tcW w:type="dxa" w:w="3249"/>
+          </w:tcPr>
+          <w:p>
+            <w:r>
+              <w:t>screen_name</w:t>
+            </w:r>
+          </w:p>
+        </w:tc>
+        <w:tc>
+          <w:tcPr>
+            <w:tcW w:type="dxa" w:w="3249"/>
+          </w:tcPr>
+          <w:p>
+            <w:r>
+              <w:t>Cyber aggression telemetry — navigation context</w:t>
+            </w:r>
+          </w:p>
+        </w:tc>
+      </w:tr>
+      <w:tr>
+        <w:tc>
+          <w:tcPr>
+            <w:tcW w:type="dxa" w:w="3249"/>
+          </w:tcPr>
+          <w:p>
+            <w:r>
+              <w:t>phone_telemetry</w:t>
+            </w:r>
+          </w:p>
+        </w:tc>
+        <w:tc>
+          <w:tcPr>
+            <w:tcW w:type="dxa" w:w="3249"/>
+          </w:tcPr>
+          <w:p>
+            <w:r>
+              <w:t>latency_ms</w:t>
+            </w:r>
+          </w:p>
+        </w:tc>
+        <w:tc>
+          <w:tcPr>
+            <w:tcW w:type="dxa" w:w="3249"/>
+          </w:tcPr>
+          <w:p>
+            <w:r>
+              <w:t>Cyber aggression telemetry — response hesitation signal</w:t>
+            </w:r>
+          </w:p>
+        </w:tc>
+      </w:tr>
+      <w:tr>
+        <w:tc>
+          <w:tcPr>
+            <w:tcW w:type="dxa" w:w="3249"/>
+          </w:tcPr>
+          <w:p>
+            <w:r>
+              <w:t>phone_telemetry</w:t>
+            </w:r>
+          </w:p>
+        </w:tc>
+        <w:tc>
+          <w:tcPr>
+            <w:tcW w:type="dxa" w:w="3249"/>
+          </w:tcPr>
+          <w:p>
+            <w:r>
+              <w:t>metadata (keystroke_count, delete_count)</w:t>
+            </w:r>
+          </w:p>
+        </w:tc>
+        <w:tc>
+          <w:tcPr>
+            <w:tcW w:type="dxa" w:w="3249"/>
+          </w:tcPr>
+          <w:p>
+            <w:r>
+              <w:t>Cyber aggression telemetry — compose churn signals (pending PI confirmation of construct assignment)</w:t>
+            </w:r>
+          </w:p>
+        </w:tc>
+      </w:tr>
+      <w:tr>
+        <w:tc>
+          <w:tcPr>
+            <w:tcW w:type="dxa" w:w="3249"/>
+          </w:tcPr>
+          <w:p>
+            <w:r>
+              <w:t>engagement_log</w:t>
+            </w:r>
+          </w:p>
+        </w:tc>
+        <w:tc>
+          <w:tcPr>
+            <w:tcW w:type="dxa" w:w="3249"/>
+          </w:tcPr>
+          <w:p>
+            <w:r>
+              <w:t>id</w:t>
+            </w:r>
+          </w:p>
+        </w:tc>
+        <w:tc>
+          <w:tcPr>
+            <w:tcW w:type="dxa" w:w="3249"/>
+          </w:tcPr>
+          <w:p>
+            <w:r>
+              <w:t>Infrastructure — primary key</w:t>
+            </w:r>
+          </w:p>
+        </w:tc>
+      </w:tr>
+      <w:tr>
+        <w:tc>
+          <w:tcPr>
+            <w:tcW w:type="dxa" w:w="3249"/>
+          </w:tcPr>
+          <w:p>
+            <w:r>
+              <w:t>engagement_log</w:t>
+            </w:r>
+          </w:p>
+        </w:tc>
+        <w:tc>
+          <w:tcPr>
+            <w:tcW w:type="dxa" w:w="3249"/>
+          </w:tcPr>
+          <w:p>
+            <w:r>
+              <w:t>user_id</w:t>
+            </w:r>
+          </w:p>
+        </w:tc>
+        <w:tc>
+          <w:tcPr>
+            <w:tcW w:type="dxa" w:w="3249"/>
+          </w:tcPr>
+          <w:p>
+            <w:r>
+              <w:t>Infrastructure — FK → user</w:t>
+            </w:r>
+          </w:p>
+        </w:tc>
+      </w:tr>
+      <w:tr>
+        <w:tc>
+          <w:tcPr>
+            <w:tcW w:type="dxa" w:w="3249"/>
+          </w:tcPr>
+          <w:p>
+            <w:r>
+              <w:t>engagement_log</w:t>
+            </w:r>
+          </w:p>
+        </w:tc>
+        <w:tc>
+          <w:tcPr>
+            <w:tcW w:type="dxa" w:w="3249"/>
+          </w:tcPr>
+          <w:p>
+            <w:r>
+              <w:t>jitai_log_id</w:t>
+            </w:r>
+          </w:p>
+        </w:tc>
+        <w:tc>
+          <w:tcPr>
+            <w:tcW w:type="dxa" w:w="3249"/>
+          </w:tcPr>
+          <w:p>
+            <w:r>
+              <w:t>MRT — FK → jitai_log; links engagement event to decision point</w:t>
+            </w:r>
+          </w:p>
+        </w:tc>
+      </w:tr>
+      <w:tr>
+        <w:tc>
+          <w:tcPr>
+            <w:tcW w:type="dxa" w:w="3249"/>
+          </w:tcPr>
+          <w:p>
+            <w:r>
+              <w:t>engagement_log</w:t>
+            </w:r>
+          </w:p>
+        </w:tc>
+        <w:tc>
+          <w:tcPr>
+            <w:tcW w:type="dxa" w:w="3249"/>
+          </w:tcPr>
+          <w:p>
+            <w:r>
+              <w:t>event_type</w:t>
+            </w:r>
+          </w:p>
+        </w:tc>
+        <w:tc>
+          <w:tcPr>
+            <w:tcW w:type="dxa" w:w="3249"/>
+          </w:tcPr>
+          <w:p>
+            <w:r>
+              <w:t>JITAI delivery audit — notification/EMA engagement type</w:t>
+            </w:r>
+          </w:p>
+        </w:tc>
+      </w:tr>
+      <w:tr>
+        <w:tc>
+          <w:tcPr>
+            <w:tcW w:type="dxa" w:w="3249"/>
+          </w:tcPr>
+          <w:p>
+            <w:r>
+              <w:t>engagement_log</w:t>
+            </w:r>
+          </w:p>
+        </w:tc>
+        <w:tc>
+          <w:tcPr>
+            <w:tcW w:type="dxa" w:w="3249"/>
+          </w:tcPr>
+          <w:p>
+            <w:r>
+              <w:t>occurred_at</w:t>
+            </w:r>
+          </w:p>
+        </w:tc>
+        <w:tc>
+          <w:tcPr>
+            <w:tcW w:type="dxa" w:w="3249"/>
+          </w:tcPr>
+          <w:p>
+            <w:r>
+              <w:t>JITAI delivery audit — client-side timestamp</w:t>
+            </w:r>
+          </w:p>
+        </w:tc>
+      </w:tr>
+      <w:tr>
+        <w:tc>
+          <w:tcPr>
+            <w:tcW w:type="dxa" w:w="3249"/>
+          </w:tcPr>
+          <w:p>
+            <w:r>
+              <w:t>engagement_log</w:t>
+            </w:r>
+          </w:p>
+        </w:tc>
+        <w:tc>
+          <w:tcPr>
+            <w:tcW w:type="dxa" w:w="3249"/>
+          </w:tcPr>
+          <w:p>
+            <w:r>
+              <w:t>recorded_at</w:t>
+            </w:r>
+          </w:p>
+        </w:tc>
+        <w:tc>
+          <w:tcPr>
+            <w:tcW w:type="dxa" w:w="3249"/>
+          </w:tcPr>
+          <w:p>
+            <w:r>
+              <w:t>Data provenance — server receipt timestamp</w:t>
+            </w:r>
+          </w:p>
+        </w:tc>
+      </w:tr>
+    </w:tbl>
+    <w:p>
+      <w:r>
+        <w:t/>
+      </w:r>
+    </w:p>
+    <w:p>
+      <w:pPr>
         <w:jc w:val="center"/>
       </w:pPr>
       <w:r>
@@ -4940,7 +7091,7 @@
           <w:color w:val="444444"/>
           <w:sz w:val="16"/>
         </w:rPr>
-        <w:t>Last updated: 2026-07-01 · Author: Dustin Nguyen · SMASH Research Lab, UF</w:t>
+        <w:t>Last updated: 2026-07-06 · Author: Dustin Nguyen · SMASH Research Lab, UF</w:t>
       </w:r>
     </w:p>
     <w:sectPr>

</xml_diff>

<commit_message>
Removed Device Field and deleted redudant
</commit_message>
<xml_diff>
--- a/Resources/REACT_Architecture.docx
+++ b/Resources/REACT_Architecture.docx
@@ -3831,6 +3831,211 @@
           </w:p>
         </w:tc>
       </w:tr>
+      <w:tr>
+        <w:tc>
+          <w:tcPr>
+            <w:tcW w:type="dxa" w:w="3249"/>
+          </w:tcPr>
+          <w:p>
+            <w:r>
+              <w:rPr>
+                <w:sz w:val="17"/>
+              </w:rPr>
+              <w:t>trigger_signal</w:t>
+            </w:r>
+          </w:p>
+        </w:tc>
+        <w:tc>
+          <w:tcPr>
+            <w:tcW w:type="dxa" w:w="3249"/>
+          </w:tcPr>
+          <w:p>
+            <w:r>
+              <w:rPr>
+                <w:sz w:val="17"/>
+              </w:rPr>
+              <w:t>VARCHAR(32)</w:t>
+            </w:r>
+          </w:p>
+        </w:tc>
+        <w:tc>
+          <w:tcPr>
+            <w:tcW w:type="dxa" w:w="3249"/>
+          </w:tcPr>
+          <w:p>
+            <w:r>
+              <w:rPr>
+                <w:sz w:val="17"/>
+              </w:rPr>
+              <w:t>nullable — which threshold crossed (hr_elevated, hrv_drop); NULL for EMA-only triggers</w:t>
+            </w:r>
+          </w:p>
+        </w:tc>
+      </w:tr>
+      <w:tr>
+        <w:tc>
+          <w:tcPr>
+            <w:tcW w:type="dxa" w:w="3249"/>
+          </w:tcPr>
+          <w:p>
+            <w:r>
+              <w:rPr>
+                <w:sz w:val="17"/>
+              </w:rPr>
+              <w:t>ema_mood</w:t>
+            </w:r>
+          </w:p>
+        </w:tc>
+        <w:tc>
+          <w:tcPr>
+            <w:tcW w:type="dxa" w:w="3249"/>
+          </w:tcPr>
+          <w:p>
+            <w:r>
+              <w:rPr>
+                <w:sz w:val="17"/>
+              </w:rPr>
+              <w:t>SMALLINT</w:t>
+            </w:r>
+          </w:p>
+        </w:tc>
+        <w:tc>
+          <w:tcPr>
+            <w:tcW w:type="dxa" w:w="3249"/>
+          </w:tcPr>
+          <w:p>
+            <w:r>
+              <w:rPr>
+                <w:sz w:val="17"/>
+              </w:rPr>
+              <w:t>snapshot of EMA mood score at decision time (1–7)</w:t>
+            </w:r>
+          </w:p>
+        </w:tc>
+      </w:tr>
+      <w:tr>
+        <w:tc>
+          <w:tcPr>
+            <w:tcW w:type="dxa" w:w="3249"/>
+          </w:tcPr>
+          <w:p>
+            <w:r>
+              <w:rPr>
+                <w:sz w:val="17"/>
+              </w:rPr>
+              <w:t>ema_stress</w:t>
+            </w:r>
+          </w:p>
+        </w:tc>
+        <w:tc>
+          <w:tcPr>
+            <w:tcW w:type="dxa" w:w="3249"/>
+          </w:tcPr>
+          <w:p>
+            <w:r>
+              <w:rPr>
+                <w:sz w:val="17"/>
+              </w:rPr>
+              <w:t>SMALLINT</w:t>
+            </w:r>
+          </w:p>
+        </w:tc>
+        <w:tc>
+          <w:tcPr>
+            <w:tcW w:type="dxa" w:w="3249"/>
+          </w:tcPr>
+          <w:p>
+            <w:r>
+              <w:rPr>
+                <w:sz w:val="17"/>
+              </w:rPr>
+              <w:t>snapshot of EMA stress score at decision time (1–7)</w:t>
+            </w:r>
+          </w:p>
+        </w:tc>
+      </w:tr>
+      <w:tr>
+        <w:tc>
+          <w:tcPr>
+            <w:tcW w:type="dxa" w:w="3249"/>
+          </w:tcPr>
+          <w:p>
+            <w:r>
+              <w:rPr>
+                <w:sz w:val="17"/>
+              </w:rPr>
+              <w:t>ema_energy</w:t>
+            </w:r>
+          </w:p>
+        </w:tc>
+        <w:tc>
+          <w:tcPr>
+            <w:tcW w:type="dxa" w:w="3249"/>
+          </w:tcPr>
+          <w:p>
+            <w:r>
+              <w:rPr>
+                <w:sz w:val="17"/>
+              </w:rPr>
+              <w:t>SMALLINT</w:t>
+            </w:r>
+          </w:p>
+        </w:tc>
+        <w:tc>
+          <w:tcPr>
+            <w:tcW w:type="dxa" w:w="3249"/>
+          </w:tcPr>
+          <w:p>
+            <w:r>
+              <w:rPr>
+                <w:sz w:val="17"/>
+              </w:rPr>
+              <w:t>snapshot of EMA energy score at decision time (1–7)</w:t>
+            </w:r>
+          </w:p>
+        </w:tc>
+      </w:tr>
+      <w:tr>
+        <w:tc>
+          <w:tcPr>
+            <w:tcW w:type="dxa" w:w="3249"/>
+          </w:tcPr>
+          <w:p>
+            <w:r>
+              <w:rPr>
+                <w:sz w:val="17"/>
+              </w:rPr>
+              <w:t>eligible_prompt_ids</w:t>
+            </w:r>
+          </w:p>
+        </w:tc>
+        <w:tc>
+          <w:tcPr>
+            <w:tcW w:type="dxa" w:w="3249"/>
+          </w:tcPr>
+          <w:p>
+            <w:r>
+              <w:rPr>
+                <w:sz w:val="17"/>
+              </w:rPr>
+              <w:t>JSONB</w:t>
+            </w:r>
+          </w:p>
+        </w:tc>
+        <w:tc>
+          <w:tcPr>
+            <w:tcW w:type="dxa" w:w="3249"/>
+          </w:tcPr>
+          <w:p>
+            <w:r>
+              <w:rPr>
+                <w:sz w:val="17"/>
+              </w:rPr>
+              <w:t>list of P-codes eligible for selection at this decision point; NULL when ineligible</w:t>
+            </w:r>
+          </w:p>
+        </w:tc>
+      </w:tr>
     </w:tbl>
     <w:p/>
     <w:p>
@@ -4691,13 +4896,12 @@
           <w:b/>
           <w:sz w:val="20"/>
         </w:rPr>
-        <w:t xml:space="preserve">Path 3: EMA pipeline (push-based, participant-initiated via prompt).  </w:t>
+        <w:t>Path 3: EMA pipeline (push-based, participant-initiated via prompt).  When evaluate_jitai_triggers determines a participant is eligible (MSSD above within-person threshold), it classifies the participant's emotional state from their EMA scores (mood, stress, energy) and selects a prompt_id from the 41-prompt library (Eliana Bacal, 2026-07-09). Selection rule: the trigger decides when; the EMA decides what. Of the 41 prompts, 29 are flagged as EMA-appropriate (applicable when an EMA completion triggers the decision point); the remaining 12 are telemetry-only (HR spike or HRV drop) and are excluded from selection until Labfront telemetry triggers are wired — see trigger_signal. The eligible P-code pool is filtered to the 29 EMA-appropriate prompts, narrowed by detected emotional state (Low Mood / Withdrawal, High Arousal / Anxiety, General Stress), and one prompt_id is drawn at random. The eligible pool and selected prompt_id are recorded in jitai_log. When the coin flip (draw &lt; p) says send, evaluate_jitai_triggers calls the Expo Push Notification API with the participant's push_token and the selected prompt_id. The Expo service forwards the notification to Firebase (Android) or APNs (iOS). The app receives the silent push, looks up the message template locally by prompt_id, and displays the EMA survey UI. The participant completes the EMA and the app POSTs to /ema/ with the three Likert scores. A new ema row is written with status=completed and responded_at set. The message text corresponding to prompt_id is never transmitted to or stored by the Django backend — it lives only in the app's local template store (IRB constraint).</w:t>
       </w:r>
       <w:r>
         <w:rPr>
           <w:sz w:val="20"/>
         </w:rPr>
-        <w:t>When evaluate_jitai_triggers determines a prompt should be sent (send_prompt=True), it calls the Expo Push Notification API with the participant’s push_token and a prompt_id. The Expo service forwards the notification to Firebase (Android) or APNs (iOS). The app receives the silent push, looks up the message template locally by prompt_id, and displays the EMA survey UI. The participant completes the EMA and the app POSTs to /ema/ with the three Likert scores. A new ema row is written with status=completed and responded_at set. The message text corresponding to prompt_id is never transmitted to or stored by the Django backend — it lives only in the app’s local template store (IRB constraint).</w:t>
       </w:r>
     </w:p>
     <w:p>
@@ -7091,7 +7295,7 @@
           <w:color w:val="444444"/>
           <w:sz w:val="16"/>
         </w:rPr>
-        <w:t>Last updated: 2026-07-06 · Author: Dustin Nguyen · SMASH Research Lab, UF</w:t>
+        <w:t>Last updated: 2026-07-13 · Author: Dustin Nguyen · SMASH Research Lab, UF</w:t>
       </w:r>
     </w:p>
     <w:sectPr>

</xml_diff>

<commit_message>
docs: update REACT_Architecture.docx for prompt selection and new fields
- Table 0 Step 4: describes prompt pool build from REACTprompts.csv
- Table 7 trigger_signal: updated to reflect it is reserved/null per
  Dr. Chang 2026-07-16 (HRV/sleep as second condition, not MSSD modifier)
- Table 11 (Research Construct Map): 5 new rows for eligible_prompt_ids,
  ema_mood, ema_stress, ema_energy, trigger_signal
- Path 3 paragraph: rewritten to describe catalog-based selection flow
- Last updated: 2026-07-16
</commit_message>
<xml_diff>
--- a/Resources/REACT_Architecture.docx
+++ b/Resources/REACT_Architecture.docx
@@ -309,10 +309,7 @@
           </w:tcPr>
           <w:p>
             <w:r>
-              <w:rPr>
-                <w:sz w:val="17"/>
-              </w:rPr>
-              <w:t>Reads recent EMA rows per enrolled participant. Computes MSSD (Mean Square Successive Difference) as a within-person volatility metric. Checks threshold, cooldown window, and daily prompt cap. Writes a JITAILog row (send_prompt = True/False). If send_prompt is True, fires Expo push notification.</w:t>
+              <w:t>Reads recent EMA rows per enrolled participant. Computes MSSD (Mean Square Successive Difference) volatility. If MSSD exceeds the within-person 80th-percentile threshold: builds eligible prompt pool from REACTprompts.csv (Survey-flagged prompts), draws randomly, logs decision to jitai_log, and fires Expo silent push if randomization arm = send.</w:t>
             </w:r>
           </w:p>
         </w:tc>
@@ -3864,10 +3861,7 @@
           </w:tcPr>
           <w:p>
             <w:r>
-              <w:rPr>
-                <w:sz w:val="17"/>
-              </w:rPr>
-              <w:t>nullable — which threshold crossed (hr_elevated, hrv_drop); NULL for EMA-only triggers</w:t>
+              <w:t>nullable — reserved for HRV/sleep signals per Celia's spec (Dr. Chang 2026-07-16). Currently always null. Will record e.g. 'hrv_low', 'sleep_disrupted' as a second condition alongside MSSD when wired in.</w:t>
             </w:r>
           </w:p>
         </w:tc>
@@ -4892,16 +4886,7 @@
     </w:p>
     <w:p>
       <w:r>
-        <w:rPr>
-          <w:b/>
-          <w:sz w:val="20"/>
-        </w:rPr>
-        <w:t>Path 3: EMA pipeline (push-based, participant-initiated via prompt).  When evaluate_jitai_triggers determines a participant is eligible (MSSD above within-person threshold), it classifies the participant's emotional state from their EMA scores (mood, stress, energy) and selects a prompt_id from the 41-prompt library (Eliana Bacal, 2026-07-09). Selection rule: the trigger decides when; the EMA decides what. Of the 41 prompts, 29 are flagged as EMA-appropriate (applicable when an EMA completion triggers the decision point); the remaining 12 are telemetry-only (HR spike or HRV drop) and are excluded from selection until Labfront telemetry triggers are wired — see trigger_signal. The eligible P-code pool is filtered to the 29 EMA-appropriate prompts, narrowed by detected emotional state (Low Mood / Withdrawal, High Arousal / Anxiety, General Stress), and one prompt_id is drawn at random. The eligible pool and selected prompt_id are recorded in jitai_log. When the coin flip (draw &lt; p) says send, evaluate_jitai_triggers calls the Expo Push Notification API with the participant's push_token and the selected prompt_id. The Expo service forwards the notification to Firebase (Android) or APNs (iOS). The app receives the silent push, looks up the message template locally by prompt_id, and displays the EMA survey UI. The participant completes the EMA and the app POSTs to /ema/ with the three Likert scores. A new ema row is written with status=completed and responded_at set. The message text corresponding to prompt_id is never transmitted to or stored by the Django backend — it lives only in the app's local template store (IRB constraint).</w:t>
-      </w:r>
-      <w:r>
-        <w:rPr>
-          <w:sz w:val="20"/>
-        </w:rPr>
+        <w:t>Path 3: EMA pipeline (push-based, participant-initiated via prompt). When evaluate_jitai_triggers determines a participant is eligible (MSSD exceeds their within-person 80th-percentile threshold), it builds a pool of eligible prompts from backend/app/data/REACTprompts.csv (Survey-flagged prompts only; telemetry prompts excluded until Celia's HRV/sleep spec is approved). One prompt_id is drawn at random from the pool. The eligible pool and drawn prompt are both recorded on jitai_log. A silent Expo push carries only prompt_id — no message text is transmitted or stored (IRB). The mobile app looks up message text locally by prompt_id and presents the EMA prompt. The participant's response is POST'd to /ema/ and updates the EMA row.</w:t>
       </w:r>
     </w:p>
     <w:p>
@@ -7279,6 +7264,166 @@
           </w:p>
         </w:tc>
       </w:tr>
+      <w:tr>
+        <w:tc>
+          <w:tcPr>
+            <w:tcW w:type="dxa" w:w="3249"/>
+          </w:tcPr>
+          <w:p>
+            <w:r>
+              <w:t>jitai_log</w:t>
+            </w:r>
+          </w:p>
+        </w:tc>
+        <w:tc>
+          <w:tcPr>
+            <w:tcW w:type="dxa" w:w="3249"/>
+          </w:tcPr>
+          <w:p>
+            <w:r>
+              <w:t>eligible_prompt_ids</w:t>
+            </w:r>
+          </w:p>
+        </w:tc>
+        <w:tc>
+          <w:tcPr>
+            <w:tcW w:type="dxa" w:w="3249"/>
+          </w:tcPr>
+          <w:p>
+            <w:r>
+              <w:t>MRT — JSON array of P-codes eligible at this decision point; records which prompts were available vs. which was drawn</w:t>
+            </w:r>
+          </w:p>
+        </w:tc>
+      </w:tr>
+      <w:tr>
+        <w:tc>
+          <w:tcPr>
+            <w:tcW w:type="dxa" w:w="3249"/>
+          </w:tcPr>
+          <w:p>
+            <w:r>
+              <w:t>jitai_log</w:t>
+            </w:r>
+          </w:p>
+        </w:tc>
+        <w:tc>
+          <w:tcPr>
+            <w:tcW w:type="dxa" w:w="3249"/>
+          </w:tcPr>
+          <w:p>
+            <w:r>
+              <w:t>ema_mood</w:t>
+            </w:r>
+          </w:p>
+        </w:tc>
+        <w:tc>
+          <w:tcPr>
+            <w:tcW w:type="dxa" w:w="3249"/>
+          </w:tcPr>
+          <w:p>
+            <w:r>
+              <w:t>MRT — EMA mood score at decision point (1–7 Likert); denormalized from EMA FK for flat-file analysis without joins</w:t>
+            </w:r>
+          </w:p>
+        </w:tc>
+      </w:tr>
+      <w:tr>
+        <w:tc>
+          <w:tcPr>
+            <w:tcW w:type="dxa" w:w="3249"/>
+          </w:tcPr>
+          <w:p>
+            <w:r>
+              <w:t>jitai_log</w:t>
+            </w:r>
+          </w:p>
+        </w:tc>
+        <w:tc>
+          <w:tcPr>
+            <w:tcW w:type="dxa" w:w="3249"/>
+          </w:tcPr>
+          <w:p>
+            <w:r>
+              <w:t>ema_stress</w:t>
+            </w:r>
+          </w:p>
+        </w:tc>
+        <w:tc>
+          <w:tcPr>
+            <w:tcW w:type="dxa" w:w="3249"/>
+          </w:tcPr>
+          <w:p>
+            <w:r>
+              <w:t>MRT — EMA stress score at decision point (1–7 Likert); denormalized</w:t>
+            </w:r>
+          </w:p>
+        </w:tc>
+      </w:tr>
+      <w:tr>
+        <w:tc>
+          <w:tcPr>
+            <w:tcW w:type="dxa" w:w="3249"/>
+          </w:tcPr>
+          <w:p>
+            <w:r>
+              <w:t>jitai_log</w:t>
+            </w:r>
+          </w:p>
+        </w:tc>
+        <w:tc>
+          <w:tcPr>
+            <w:tcW w:type="dxa" w:w="3249"/>
+          </w:tcPr>
+          <w:p>
+            <w:r>
+              <w:t>ema_energy</w:t>
+            </w:r>
+          </w:p>
+        </w:tc>
+        <w:tc>
+          <w:tcPr>
+            <w:tcW w:type="dxa" w:w="3249"/>
+          </w:tcPr>
+          <w:p>
+            <w:r>
+              <w:t>MRT — EMA energy score at decision point (1–7 Likert); denormalized</w:t>
+            </w:r>
+          </w:p>
+        </w:tc>
+      </w:tr>
+      <w:tr>
+        <w:tc>
+          <w:tcPr>
+            <w:tcW w:type="dxa" w:w="3249"/>
+          </w:tcPr>
+          <w:p>
+            <w:r>
+              <w:t>jitai_log</w:t>
+            </w:r>
+          </w:p>
+        </w:tc>
+        <w:tc>
+          <w:tcPr>
+            <w:tcW w:type="dxa" w:w="3249"/>
+          </w:tcPr>
+          <w:p>
+            <w:r>
+              <w:t>trigger_signal</w:t>
+            </w:r>
+          </w:p>
+        </w:tc>
+        <w:tc>
+          <w:tcPr>
+            <w:tcW w:type="dxa" w:w="3249"/>
+          </w:tcPr>
+          <w:p>
+            <w:r>
+              <w:t>JITAI decision — telemetry signal that contributed (reserved; null until HRV/sleep spec from Celia is wired in)</w:t>
+            </w:r>
+          </w:p>
+        </w:tc>
+      </w:tr>
     </w:tbl>
     <w:p>
       <w:r>
@@ -7295,7 +7440,7 @@
           <w:color w:val="444444"/>
           <w:sz w:val="16"/>
         </w:rPr>
-        <w:t>Last updated: 2026-07-13 · Author: Dustin Nguyen · SMASH Research Lab, UF</w:t>
+        <w:t>Last updated: 2026-07-16 · Author: Dustin Nguyen · SMASH Research Lab, UF</w:t>
       </w:r>
     </w:p>
     <w:sectPr>

</xml_diff>

<commit_message>
Updated docxs after schema change
</commit_message>
<xml_diff>
--- a/Resources/REACT_Architecture.docx
+++ b/Resources/REACT_Architecture.docx
@@ -391,10 +391,7 @@
           </w:tcPr>
           <w:p>
             <w:r>
-              <w:rPr>
-                <w:sz w:val="17"/>
-              </w:rPr>
-              <w:t>Participant responds to EMA prompt in-app. App POSTs EMA response to /ema/. Push token is refreshed on each app launch via User.push_token.</w:t>
+              <w:t>Participant responds to EMA prompt in-app. App calls GET /ema/next/ for the rotation-aware item list, then POSTs answers to /ema/responses/. App also calls POST /jitai/receipt/ to report when a JITAI push was received on-device. Push token is refreshed on each app launch via User.push_token.</w:t>
             </w:r>
           </w:p>
         </w:tc>
@@ -996,42 +993,30 @@
         <w:tc>
           <w:tcPr>
             <w:tcW w:type="dxa" w:w="3249"/>
-            <w:shd w:val="clear" w:color="auto" w:fill="EEF2FA"/>
-          </w:tcPr>
-          <w:p>
-            <w:r>
-              <w:rPr>
-                <w:sz w:val="17"/>
-              </w:rPr>
-              <w:t>POST</w:t>
-            </w:r>
-          </w:p>
-        </w:tc>
-        <w:tc>
-          <w:tcPr>
-            <w:tcW w:type="dxa" w:w="3249"/>
-            <w:shd w:val="clear" w:color="auto" w:fill="EEF2FA"/>
-          </w:tcPr>
-          <w:p>
-            <w:r>
-              <w:rPr>
-                <w:sz w:val="17"/>
-              </w:rPr>
-              <w:t>/jitai/</w:t>
-            </w:r>
-          </w:p>
-        </w:tc>
-        <w:tc>
-          <w:tcPr>
-            <w:tcW w:type="dxa" w:w="3249"/>
-            <w:shd w:val="clear" w:color="auto" w:fill="EEF2FA"/>
-          </w:tcPr>
-          <w:p>
-            <w:r>
-              <w:rPr>
-                <w:sz w:val="17"/>
-              </w:rPr>
-              <w:t>Internal — Celery logs a triggered intervention</w:t>
+          </w:tcPr>
+          <w:p>
+            <w:r>
+              <w:t>GET</w:t>
+            </w:r>
+          </w:p>
+        </w:tc>
+        <w:tc>
+          <w:tcPr>
+            <w:tcW w:type="dxa" w:w="3249"/>
+          </w:tcPr>
+          <w:p>
+            <w:r>
+              <w:t>/ema/next/</w:t>
+            </w:r>
+          </w:p>
+        </w:tc>
+        <w:tc>
+          <w:tcPr>
+            <w:tcW w:type="dxa" w:w="3249"/>
+          </w:tcPr>
+          <w:p>
+            <w:r>
+              <w:t>Fetch the next EMA prompt for the authenticated participant (rotation-aware; mobile app)</w:t>
             </w:r>
           </w:p>
         </w:tc>
@@ -1043,36 +1028,27 @@
           </w:tcPr>
           <w:p>
             <w:r>
-              <w:rPr>
-                <w:sz w:val="17"/>
-              </w:rPr>
-              <w:t>GET</w:t>
-            </w:r>
-          </w:p>
-        </w:tc>
-        <w:tc>
-          <w:tcPr>
-            <w:tcW w:type="dxa" w:w="3249"/>
-          </w:tcPr>
-          <w:p>
-            <w:r>
-              <w:rPr>
-                <w:sz w:val="17"/>
-              </w:rPr>
-              <w:t>/jitai/{user_id}/</w:t>
-            </w:r>
-          </w:p>
-        </w:tc>
-        <w:tc>
-          <w:tcPr>
-            <w:tcW w:type="dxa" w:w="3249"/>
-          </w:tcPr>
-          <w:p>
-            <w:r>
-              <w:rPr>
-                <w:sz w:val="17"/>
-              </w:rPr>
-              <w:t>Fetch JITAI history (dashboard / admin)</w:t>
+              <w:t>POST</w:t>
+            </w:r>
+          </w:p>
+        </w:tc>
+        <w:tc>
+          <w:tcPr>
+            <w:tcW w:type="dxa" w:w="3249"/>
+          </w:tcPr>
+          <w:p>
+            <w:r>
+              <w:t>/ema/responses/</w:t>
+            </w:r>
+          </w:p>
+        </w:tc>
+        <w:tc>
+          <w:tcPr>
+            <w:tcW w:type="dxa" w:w="3249"/>
+          </w:tcPr>
+          <w:p>
+            <w:r>
+              <w:t>Submit answers to the item(s) served by /ema/next/ (mobile app)</w:t>
             </w:r>
           </w:p>
         </w:tc>
@@ -1088,7 +1064,7 @@
               <w:rPr>
                 <w:sz w:val="17"/>
               </w:rPr>
-              <w:t>GET</w:t>
+              <w:t>POST</w:t>
             </w:r>
           </w:p>
         </w:tc>
@@ -1102,7 +1078,7 @@
               <w:rPr>
                 <w:sz w:val="17"/>
               </w:rPr>
-              <w:t>/telemetry/hr/{user_id}/</w:t>
+              <w:t>/jitai/</w:t>
             </w:r>
           </w:p>
         </w:tc>
@@ -1116,7 +1092,7 @@
               <w:rPr>
                 <w:sz w:val="17"/>
               </w:rPr>
-              <w:t>Fetch recent HR samples (dashboard)</w:t>
+              <w:t>Internal — Celery logs a triggered intervention</w:t>
             </w:r>
           </w:p>
         </w:tc>
@@ -1144,7 +1120,7 @@
               <w:rPr>
                 <w:sz w:val="17"/>
               </w:rPr>
-              <w:t>/telemetry/stress/{user_id}/</w:t>
+              <w:t>/jitai/{user_id}/</w:t>
             </w:r>
           </w:p>
         </w:tc>
@@ -1157,7 +1133,7 @@
               <w:rPr>
                 <w:sz w:val="17"/>
               </w:rPr>
-              <w:t>Fetch recent stress samples (dashboard)</w:t>
+              <w:t>Fetch JITAI history (dashboard / admin)</w:t>
             </w:r>
           </w:p>
         </w:tc>
@@ -1166,13 +1142,9 @@
         <w:tc>
           <w:tcPr>
             <w:tcW w:type="dxa" w:w="3249"/>
-            <w:shd w:val="clear" w:color="auto" w:fill="EEF2FA"/>
-          </w:tcPr>
-          <w:p>
-            <w:r>
-              <w:rPr>
-                <w:sz w:val="17"/>
-              </w:rPr>
+          </w:tcPr>
+          <w:p>
+            <w:r>
               <w:t>POST</w:t>
             </w:r>
           </w:p>
@@ -1180,28 +1152,20 @@
         <w:tc>
           <w:tcPr>
             <w:tcW w:type="dxa" w:w="3249"/>
-            <w:shd w:val="clear" w:color="auto" w:fill="EEF2FA"/>
-          </w:tcPr>
-          <w:p>
-            <w:r>
-              <w:rPr>
-                <w:sz w:val="17"/>
-              </w:rPr>
-              <w:t>/telemetry/phone/</w:t>
-            </w:r>
-          </w:p>
-        </w:tc>
-        <w:tc>
-          <w:tcPr>
-            <w:tcW w:type="dxa" w:w="3249"/>
-            <w:shd w:val="clear" w:color="auto" w:fill="EEF2FA"/>
-          </w:tcPr>
-          <w:p>
-            <w:r>
-              <w:rPr>
-                <w:sz w:val="17"/>
-              </w:rPr>
-              <w:t>Ingest compose surface event from mobile app</w:t>
+          </w:tcPr>
+          <w:p>
+            <w:r>
+              <w:t>/jitai/receipt/</w:t>
+            </w:r>
+          </w:p>
+        </w:tc>
+        <w:tc>
+          <w:tcPr>
+            <w:tcW w:type="dxa" w:w="3249"/>
+          </w:tcPr>
+          <w:p>
+            <w:r>
+              <w:t>Mobile reports device-received timestamp for a JITAI push (delivery latency measurement)</w:t>
             </w:r>
           </w:p>
         </w:tc>
@@ -1210,39 +1174,42 @@
         <w:tc>
           <w:tcPr>
             <w:tcW w:type="dxa" w:w="3249"/>
+            <w:shd w:val="clear" w:color="auto" w:fill="EEF2FA"/>
           </w:tcPr>
           <w:p>
             <w:r>
               <w:rPr>
                 <w:sz w:val="17"/>
               </w:rPr>
-              <w:t>POST</w:t>
-            </w:r>
-          </w:p>
-        </w:tc>
-        <w:tc>
-          <w:tcPr>
-            <w:tcW w:type="dxa" w:w="3249"/>
+              <w:t>GET</w:t>
+            </w:r>
+          </w:p>
+        </w:tc>
+        <w:tc>
+          <w:tcPr>
+            <w:tcW w:type="dxa" w:w="3249"/>
+            <w:shd w:val="clear" w:color="auto" w:fill="EEF2FA"/>
           </w:tcPr>
           <w:p>
             <w:r>
               <w:rPr>
                 <w:sz w:val="17"/>
               </w:rPr>
-              <w:t>/telemetry/engagement/</w:t>
-            </w:r>
-          </w:p>
-        </w:tc>
-        <w:tc>
-          <w:tcPr>
-            <w:tcW w:type="dxa" w:w="3249"/>
+              <w:t>/telemetry/hr/{user_id}/</w:t>
+            </w:r>
+          </w:p>
+        </w:tc>
+        <w:tc>
+          <w:tcPr>
+            <w:tcW w:type="dxa" w:w="3249"/>
+            <w:shd w:val="clear" w:color="auto" w:fill="EEF2FA"/>
           </w:tcPr>
           <w:p>
             <w:r>
               <w:rPr>
                 <w:sz w:val="17"/>
               </w:rPr>
-              <w:t>Ingest EMA / notification engagement event from mobile app</w:t>
+              <w:t>Fetch recent HR samples (dashboard)</w:t>
             </w:r>
           </w:p>
         </w:tc>
@@ -1257,6 +1224,48 @@
               <w:rPr>
                 <w:sz w:val="17"/>
               </w:rPr>
+              <w:t>GET</w:t>
+            </w:r>
+          </w:p>
+        </w:tc>
+        <w:tc>
+          <w:tcPr>
+            <w:tcW w:type="dxa" w:w="3249"/>
+          </w:tcPr>
+          <w:p>
+            <w:r>
+              <w:rPr>
+                <w:sz w:val="17"/>
+              </w:rPr>
+              <w:t>/telemetry/stress/{user_id}/</w:t>
+            </w:r>
+          </w:p>
+        </w:tc>
+        <w:tc>
+          <w:tcPr>
+            <w:tcW w:type="dxa" w:w="3249"/>
+          </w:tcPr>
+          <w:p>
+            <w:r>
+              <w:rPr>
+                <w:sz w:val="17"/>
+              </w:rPr>
+              <w:t>Fetch recent stress samples (dashboard)</w:t>
+            </w:r>
+          </w:p>
+        </w:tc>
+      </w:tr>
+      <w:tr>
+        <w:tc>
+          <w:tcPr>
+            <w:tcW w:type="dxa" w:w="3249"/>
+            <w:shd w:val="clear" w:color="auto" w:fill="EEF2FA"/>
+          </w:tcPr>
+          <w:p>
+            <w:r>
+              <w:rPr>
+                <w:sz w:val="17"/>
+              </w:rPr>
               <w:t>POST</w:t>
             </w:r>
           </w:p>
@@ -1264,12 +1273,96 @@
         <w:tc>
           <w:tcPr>
             <w:tcW w:type="dxa" w:w="3249"/>
+            <w:shd w:val="clear" w:color="auto" w:fill="EEF2FA"/>
           </w:tcPr>
           <w:p>
             <w:r>
               <w:rPr>
                 <w:sz w:val="17"/>
               </w:rPr>
+              <w:t>/telemetry/phone/</w:t>
+            </w:r>
+          </w:p>
+        </w:tc>
+        <w:tc>
+          <w:tcPr>
+            <w:tcW w:type="dxa" w:w="3249"/>
+            <w:shd w:val="clear" w:color="auto" w:fill="EEF2FA"/>
+          </w:tcPr>
+          <w:p>
+            <w:r>
+              <w:rPr>
+                <w:sz w:val="17"/>
+              </w:rPr>
+              <w:t>Ingest compose surface event from mobile app</w:t>
+            </w:r>
+          </w:p>
+        </w:tc>
+      </w:tr>
+      <w:tr>
+        <w:tc>
+          <w:tcPr>
+            <w:tcW w:type="dxa" w:w="3249"/>
+          </w:tcPr>
+          <w:p>
+            <w:r>
+              <w:rPr>
+                <w:sz w:val="17"/>
+              </w:rPr>
+              <w:t>POST</w:t>
+            </w:r>
+          </w:p>
+        </w:tc>
+        <w:tc>
+          <w:tcPr>
+            <w:tcW w:type="dxa" w:w="3249"/>
+          </w:tcPr>
+          <w:p>
+            <w:r>
+              <w:rPr>
+                <w:sz w:val="17"/>
+              </w:rPr>
+              <w:t>/telemetry/engagement/</w:t>
+            </w:r>
+          </w:p>
+        </w:tc>
+        <w:tc>
+          <w:tcPr>
+            <w:tcW w:type="dxa" w:w="3249"/>
+          </w:tcPr>
+          <w:p>
+            <w:r>
+              <w:rPr>
+                <w:sz w:val="17"/>
+              </w:rPr>
+              <w:t>Ingest EMA / notification engagement event from mobile app</w:t>
+            </w:r>
+          </w:p>
+        </w:tc>
+      </w:tr>
+      <w:tr>
+        <w:tc>
+          <w:tcPr>
+            <w:tcW w:type="dxa" w:w="3249"/>
+          </w:tcPr>
+          <w:p>
+            <w:r>
+              <w:rPr>
+                <w:sz w:val="17"/>
+              </w:rPr>
+              <w:t>POST</w:t>
+            </w:r>
+          </w:p>
+        </w:tc>
+        <w:tc>
+          <w:tcPr>
+            <w:tcW w:type="dxa" w:w="3249"/>
+          </w:tcPr>
+          <w:p>
+            <w:r>
+              <w:rPr>
+                <w:sz w:val="17"/>
+              </w:rPr>
               <w:t>/telemetry/ingest/</w:t>
             </w:r>
           </w:p>
@@ -1284,6 +1377,70 @@
                 <w:sz w:val="17"/>
               </w:rPr>
               <w:t>Internal — Celery bulk-ingests HeartRateSample, StressSample, EMA, and JITAILog rows from Fitabase/Labfront polling</w:t>
+            </w:r>
+          </w:p>
+        </w:tc>
+      </w:tr>
+      <w:tr>
+        <w:tc>
+          <w:tcPr>
+            <w:tcW w:type="dxa" w:w="3249"/>
+          </w:tcPr>
+          <w:p>
+            <w:r>
+              <w:t>GET</w:t>
+            </w:r>
+          </w:p>
+        </w:tc>
+        <w:tc>
+          <w:tcPr>
+            <w:tcW w:type="dxa" w:w="3249"/>
+          </w:tcPr>
+          <w:p>
+            <w:r>
+              <w:t>/dashboard/participants/</w:t>
+            </w:r>
+          </w:p>
+        </w:tc>
+        <w:tc>
+          <w:tcPr>
+            <w:tcW w:type="dxa" w:w="3249"/>
+          </w:tcPr>
+          <w:p>
+            <w:r>
+              <w:t>Participant sync/push/receipt status feed (dashboard; staff or X-Dashboard-API-Key auth)</w:t>
+            </w:r>
+          </w:p>
+        </w:tc>
+      </w:tr>
+      <w:tr>
+        <w:tc>
+          <w:tcPr>
+            <w:tcW w:type="dxa" w:w="3249"/>
+          </w:tcPr>
+          <w:p>
+            <w:r>
+              <w:t>GET</w:t>
+            </w:r>
+          </w:p>
+        </w:tc>
+        <w:tc>
+          <w:tcPr>
+            <w:tcW w:type="dxa" w:w="3249"/>
+          </w:tcPr>
+          <w:p>
+            <w:r>
+              <w:t>/dashboard/latency-events/</w:t>
+            </w:r>
+          </w:p>
+        </w:tc>
+        <w:tc>
+          <w:tcPr>
+            <w:tcW w:type="dxa" w:w="3249"/>
+          </w:tcPr>
+          <w:p>
+            <w:r>
+              <w:t>JITAI delivery latency + engagement event feed (dashboard; staff or X-Dashboard-API-Key auth)</w:t>
             </w:r>
           </w:p>
         </w:tc>
@@ -2730,11 +2887,7 @@
     </w:p>
     <w:p>
       <w:r>
-        <w:rPr>
-          <w:i/>
-          <w:sz w:val="19"/>
-        </w:rPr>
-        <w:t>Ecological Momentary Assessment responses. Three 1–7 Likert items: mood, stress, energy.</w:t>
+        <w:t>Ecological Momentary Assessment responses. Three legacy 1–7 Likert fields (mood, stress, energy) plus the rotation-item bank answered via item_responses (see ema_item_response below). ema_type/source_jitai_log_id/outcome_window_* support the post-decision-point outcome window served by GET /ema/next/.</w:t>
       </w:r>
     </w:p>
     <w:tbl>
@@ -3066,6 +3219,181 @@
         <w:tc>
           <w:tcPr>
             <w:tcW w:type="dxa" w:w="3249"/>
+            <w:shd w:val="clear" w:color="auto" w:fill="EEF2FA"/>
+          </w:tcPr>
+          <w:p>
+            <w:r>
+              <w:t>ema_type</w:t>
+            </w:r>
+          </w:p>
+        </w:tc>
+        <w:tc>
+          <w:tcPr>
+            <w:tcW w:type="dxa" w:w="3249"/>
+            <w:shd w:val="clear" w:color="auto" w:fill="EEF2FA"/>
+          </w:tcPr>
+          <w:p>
+            <w:r>
+              <w:t>VARCHAR(32)</w:t>
+            </w:r>
+          </w:p>
+        </w:tc>
+        <w:tc>
+          <w:tcPr>
+            <w:tcW w:type="dxa" w:w="3249"/>
+            <w:shd w:val="clear" w:color="auto" w:fill="EEF2FA"/>
+          </w:tcPr>
+          <w:p>
+            <w:r>
+              <w:t>scheduled_check_in / post_prompt / extra_check_in; default: scheduled_check_in</w:t>
+            </w:r>
+          </w:p>
+        </w:tc>
+      </w:tr>
+      <w:tr>
+        <w:tc>
+          <w:tcPr>
+            <w:tcW w:type="dxa" w:w="3249"/>
+            <w:shd w:val="clear" w:color="auto" w:fill="EEF2FA"/>
+          </w:tcPr>
+          <w:p>
+            <w:r>
+              <w:t>source_jitai_log_id</w:t>
+            </w:r>
+          </w:p>
+        </w:tc>
+        <w:tc>
+          <w:tcPr>
+            <w:tcW w:type="dxa" w:w="3249"/>
+            <w:shd w:val="clear" w:color="auto" w:fill="EEF2FA"/>
+          </w:tcPr>
+          <w:p>
+            <w:r>
+              <w:t>INT</w:t>
+            </w:r>
+          </w:p>
+        </w:tc>
+        <w:tc>
+          <w:tcPr>
+            <w:tcW w:type="dxa" w:w="3249"/>
+            <w:shd w:val="clear" w:color="auto" w:fill="EEF2FA"/>
+          </w:tcPr>
+          <w:p>
+            <w:r>
+              <w:t>FK → jitai_log; nullable — the JITAILog that opened this post-prompt/extra check-in</w:t>
+            </w:r>
+          </w:p>
+        </w:tc>
+      </w:tr>
+      <w:tr>
+        <w:tc>
+          <w:tcPr>
+            <w:tcW w:type="dxa" w:w="3249"/>
+            <w:shd w:val="clear" w:color="auto" w:fill="EEF2FA"/>
+          </w:tcPr>
+          <w:p>
+            <w:r>
+              <w:t>outcome_window_start</w:t>
+            </w:r>
+          </w:p>
+        </w:tc>
+        <w:tc>
+          <w:tcPr>
+            <w:tcW w:type="dxa" w:w="3249"/>
+            <w:shd w:val="clear" w:color="auto" w:fill="EEF2FA"/>
+          </w:tcPr>
+          <w:p>
+            <w:r>
+              <w:t>DATETIME</w:t>
+            </w:r>
+          </w:p>
+        </w:tc>
+        <w:tc>
+          <w:tcPr>
+            <w:tcW w:type="dxa" w:w="3249"/>
+            <w:shd w:val="clear" w:color="auto" w:fill="EEF2FA"/>
+          </w:tcPr>
+          <w:p>
+            <w:r>
+              <w:t>nullable — start of the 2-hour post-decision-point outcome window</w:t>
+            </w:r>
+          </w:p>
+        </w:tc>
+      </w:tr>
+      <w:tr>
+        <w:tc>
+          <w:tcPr>
+            <w:tcW w:type="dxa" w:w="3249"/>
+            <w:shd w:val="clear" w:color="auto" w:fill="EEF2FA"/>
+          </w:tcPr>
+          <w:p>
+            <w:r>
+              <w:t>outcome_window_end</w:t>
+            </w:r>
+          </w:p>
+        </w:tc>
+        <w:tc>
+          <w:tcPr>
+            <w:tcW w:type="dxa" w:w="3249"/>
+            <w:shd w:val="clear" w:color="auto" w:fill="EEF2FA"/>
+          </w:tcPr>
+          <w:p>
+            <w:r>
+              <w:t>DATETIME</w:t>
+            </w:r>
+          </w:p>
+        </w:tc>
+        <w:tc>
+          <w:tcPr>
+            <w:tcW w:type="dxa" w:w="3249"/>
+            <w:shd w:val="clear" w:color="auto" w:fill="EEF2FA"/>
+          </w:tcPr>
+          <w:p>
+            <w:r>
+              <w:t>nullable — end of the 2-hour post-decision-point outcome window</w:t>
+            </w:r>
+          </w:p>
+        </w:tc>
+      </w:tr>
+      <w:tr>
+        <w:tc>
+          <w:tcPr>
+            <w:tcW w:type="dxa" w:w="3249"/>
+            <w:shd w:val="clear" w:color="auto" w:fill="EEF2FA"/>
+          </w:tcPr>
+          <w:p>
+            <w:r>
+              <w:t>expires_at</w:t>
+            </w:r>
+          </w:p>
+        </w:tc>
+        <w:tc>
+          <w:tcPr>
+            <w:tcW w:type="dxa" w:w="3249"/>
+            <w:shd w:val="clear" w:color="auto" w:fill="EEF2FA"/>
+          </w:tcPr>
+          <w:p>
+            <w:r>
+              <w:t>DATETIME</w:t>
+            </w:r>
+          </w:p>
+        </w:tc>
+        <w:tc>
+          <w:tcPr>
+            <w:tcW w:type="dxa" w:w="3249"/>
+            <w:shd w:val="clear" w:color="auto" w:fill="EEF2FA"/>
+          </w:tcPr>
+          <w:p>
+            <w:r>
+              <w:t>nullable — currently mirrors outcome_window_end</w:t>
+            </w:r>
+          </w:p>
+        </w:tc>
+      </w:tr>
+      <w:tr>
+        <w:tc>
+          <w:tcPr>
+            <w:tcW w:type="dxa" w:w="3249"/>
           </w:tcPr>
           <w:p>
             <w:r>
@@ -3190,6 +3518,160 @@
       </w:tr>
     </w:tbl>
     <w:p/>
+    <w:p>
+      <w:pPr>
+        <w:pStyle w:val="Heading2"/>
+      </w:pPr>
+      <w:r>
+        <w:t>ema_item_response</w:t>
+      </w:r>
+    </w:p>
+    <w:p>
+      <w:pPr/>
+      <w:r>
+        <w:t>One row per rotation item answered within a single EMA check-in (B1–B8). Introduced with the item-bank rotation endpoints (GET /ema/next/, POST /ema/responses/).</w:t>
+      </w:r>
+    </w:p>
+    <w:tbl>
+      <w:tblPr>
+        <w:tblStyle w:val="TableGrid"/>
+        <w:tblW w:type="auto" w:w="0"/>
+        <w:tblLook w:firstColumn="1" w:firstRow="1" w:lastColumn="0" w:lastRow="0" w:noHBand="0" w:noVBand="1" w:val="04A0"/>
+      </w:tblPr>
+      <w:tblGrid>
+        <w:gridCol w:w="3249"/>
+        <w:gridCol w:w="3249"/>
+        <w:gridCol w:w="3249"/>
+      </w:tblGrid>
+      <w:tr>
+        <w:tc>
+          <w:tcPr>
+            <w:tcW w:type="dxa" w:w="3249"/>
+          </w:tcPr>
+          <w:p>
+            <w:r>
+              <w:t>Column</w:t>
+            </w:r>
+          </w:p>
+        </w:tc>
+        <w:tc>
+          <w:tcPr>
+            <w:tcW w:type="dxa" w:w="3249"/>
+          </w:tcPr>
+          <w:p>
+            <w:r>
+              <w:t>Type</w:t>
+            </w:r>
+          </w:p>
+        </w:tc>
+        <w:tc>
+          <w:tcPr>
+            <w:tcW w:type="dxa" w:w="3249"/>
+          </w:tcPr>
+          <w:p>
+            <w:r>
+              <w:t>Notes / Constraint</w:t>
+            </w:r>
+          </w:p>
+        </w:tc>
+      </w:tr>
+      <w:tr>
+        <w:tc>
+          <w:tcPr>
+            <w:tcW w:type="dxa" w:w="3249"/>
+          </w:tcPr>
+          <w:p>
+            <w:r>
+              <w:t>id</w:t>
+            </w:r>
+          </w:p>
+        </w:tc>
+        <w:tc>
+          <w:tcPr>
+            <w:tcW w:type="dxa" w:w="3249"/>
+          </w:tcPr>
+          <w:p>
+            <w:r>
+              <w:t>INT</w:t>
+            </w:r>
+          </w:p>
+        </w:tc>
+        <w:tc>
+          <w:tcPr>
+            <w:tcW w:type="dxa" w:w="3249"/>
+          </w:tcPr>
+          <w:p>
+            <w:r>
+              <w:t>PRIMARY KEY</w:t>
+            </w:r>
+          </w:p>
+        </w:tc>
+      </w:tr>
+      <w:tr>
+        <w:tc>
+          <w:tcPr>
+            <w:tcW w:type="dxa" w:w="3249"/>
+          </w:tcPr>
+          <w:p>
+            <w:r>
+              <w:t>ema_id</w:t>
+            </w:r>
+          </w:p>
+        </w:tc>
+        <w:tc>
+          <w:tcPr>
+            <w:tcW w:type="dxa" w:w="3249"/>
+          </w:tcPr>
+          <w:p>
+            <w:r>
+              <w:t>INT</w:t>
+            </w:r>
+          </w:p>
+        </w:tc>
+        <w:tc>
+          <w:tcPr>
+            <w:tcW w:type="dxa" w:w="3249"/>
+          </w:tcPr>
+          <w:p>
+            <w:r>
+              <w:t>FK → ema</w:t>
+            </w:r>
+          </w:p>
+        </w:tc>
+      </w:tr>
+      <w:tr>
+        <w:tc>
+          <w:tcPr>
+            <w:tcW w:type="dxa" w:w="3249"/>
+          </w:tcPr>
+          <w:p>
+            <w:r>
+              <w:t>item_id</w:t>
+            </w:r>
+          </w:p>
+        </w:tc>
+        <w:tc>
+          <w:tcPr>
+            <w:tcW w:type="dxa" w:w="3249"/>
+          </w:tcPr>
+          <w:p>
+            <w:r>
+              <w:t>VARCHAR(8)</w:t>
+            </w:r>
+          </w:p>
+        </w:tc>
+        <w:tc>
+          <w:tcPr>
+            <w:tcW w:type="dxa" w:w="3249"/>
+          </w:tcPr>
+          <w:p>
+            <w:r>
+              <w:t>B1–B8; unique together with ema_id (one response per item per check-in)</w:t>
+            </w:r>
+          </w:p>
+        </w:tc>
+      </w:tr>
+    </w:tbl>
     <w:p>
       <w:pPr>
         <w:pStyle w:val="Heading2"/>
@@ -8073,6 +8555,262 @@
           </w:p>
         </w:tc>
       </w:tr>
+      <w:tr>
+        <w:tc>
+          <w:tcPr>
+            <w:tcW w:type="dxa" w:w="3249"/>
+          </w:tcPr>
+          <w:p>
+            <w:r>
+              <w:t>ema</w:t>
+            </w:r>
+          </w:p>
+        </w:tc>
+        <w:tc>
+          <w:tcPr>
+            <w:tcW w:type="dxa" w:w="3249"/>
+          </w:tcPr>
+          <w:p>
+            <w:r>
+              <w:t>ema_type</w:t>
+            </w:r>
+          </w:p>
+        </w:tc>
+        <w:tc>
+          <w:tcPr>
+            <w:tcW w:type="dxa" w:w="3249"/>
+          </w:tcPr>
+          <w:p>
+            <w:r>
+              <w:t>JITAI delivery audit — distinguishes scheduled check-ins from post-decision-point / extra check-ins</w:t>
+            </w:r>
+          </w:p>
+        </w:tc>
+      </w:tr>
+      <w:tr>
+        <w:tc>
+          <w:tcPr>
+            <w:tcW w:type="dxa" w:w="3249"/>
+          </w:tcPr>
+          <w:p>
+            <w:r>
+              <w:t>ema</w:t>
+            </w:r>
+          </w:p>
+        </w:tc>
+        <w:tc>
+          <w:tcPr>
+            <w:tcW w:type="dxa" w:w="3249"/>
+          </w:tcPr>
+          <w:p>
+            <w:r>
+              <w:t>source_jitai_log_id</w:t>
+            </w:r>
+          </w:p>
+        </w:tc>
+        <w:tc>
+          <w:tcPr>
+            <w:tcW w:type="dxa" w:w="3249"/>
+          </w:tcPr>
+          <w:p>
+            <w:r>
+              <w:t>MRT — FK → jitai_log; links a post-prompt check-in to the decision point that opened its outcome window</w:t>
+            </w:r>
+          </w:p>
+        </w:tc>
+      </w:tr>
+      <w:tr>
+        <w:tc>
+          <w:tcPr>
+            <w:tcW w:type="dxa" w:w="3249"/>
+          </w:tcPr>
+          <w:p>
+            <w:r>
+              <w:t>ema</w:t>
+            </w:r>
+          </w:p>
+        </w:tc>
+        <w:tc>
+          <w:tcPr>
+            <w:tcW w:type="dxa" w:w="3249"/>
+          </w:tcPr>
+          <w:p>
+            <w:r>
+              <w:t>outcome_window_start, outcome_window_end</w:t>
+            </w:r>
+          </w:p>
+        </w:tc>
+        <w:tc>
+          <w:tcPr>
+            <w:tcW w:type="dxa" w:w="3249"/>
+          </w:tcPr>
+          <w:p>
+            <w:r>
+              <w:t>MRT — bounds of the 2-hour post-decision-point outcome window</w:t>
+            </w:r>
+          </w:p>
+        </w:tc>
+      </w:tr>
+      <w:tr>
+        <w:tc>
+          <w:tcPr>
+            <w:tcW w:type="dxa" w:w="3249"/>
+          </w:tcPr>
+          <w:p>
+            <w:r>
+              <w:t>ema</w:t>
+            </w:r>
+          </w:p>
+        </w:tc>
+        <w:tc>
+          <w:tcPr>
+            <w:tcW w:type="dxa" w:w="3249"/>
+          </w:tcPr>
+          <w:p>
+            <w:r>
+              <w:t>expires_at</w:t>
+            </w:r>
+          </w:p>
+        </w:tc>
+        <w:tc>
+          <w:tcPr>
+            <w:tcW w:type="dxa" w:w="3249"/>
+          </w:tcPr>
+          <w:p>
+            <w:r>
+              <w:t>JITAI delivery audit — when this prompt stops being offered</w:t>
+            </w:r>
+          </w:p>
+        </w:tc>
+      </w:tr>
+      <w:tr>
+        <w:tc>
+          <w:tcPr>
+            <w:tcW w:type="dxa" w:w="3249"/>
+          </w:tcPr>
+          <w:p>
+            <w:r>
+              <w:t>ema_item_response</w:t>
+            </w:r>
+          </w:p>
+        </w:tc>
+        <w:tc>
+          <w:tcPr>
+            <w:tcW w:type="dxa" w:w="3249"/>
+          </w:tcPr>
+          <w:p>
+            <w:r>
+              <w:t>id</w:t>
+            </w:r>
+          </w:p>
+        </w:tc>
+        <w:tc>
+          <w:tcPr>
+            <w:tcW w:type="dxa" w:w="3249"/>
+          </w:tcPr>
+          <w:p>
+            <w:r>
+              <w:t>Infrastructure — primary key</w:t>
+            </w:r>
+          </w:p>
+        </w:tc>
+      </w:tr>
+      <w:tr>
+        <w:tc>
+          <w:tcPr>
+            <w:tcW w:type="dxa" w:w="3249"/>
+          </w:tcPr>
+          <w:p>
+            <w:r>
+              <w:t>ema_item_response</w:t>
+            </w:r>
+          </w:p>
+        </w:tc>
+        <w:tc>
+          <w:tcPr>
+            <w:tcW w:type="dxa" w:w="3249"/>
+          </w:tcPr>
+          <w:p>
+            <w:r>
+              <w:t>ema_id</w:t>
+            </w:r>
+          </w:p>
+        </w:tc>
+        <w:tc>
+          <w:tcPr>
+            <w:tcW w:type="dxa" w:w="3249"/>
+          </w:tcPr>
+          <w:p>
+            <w:r>
+              <w:t>Infrastructure — FK → ema</w:t>
+            </w:r>
+          </w:p>
+        </w:tc>
+      </w:tr>
+      <w:tr>
+        <w:tc>
+          <w:tcPr>
+            <w:tcW w:type="dxa" w:w="3249"/>
+          </w:tcPr>
+          <w:p>
+            <w:r>
+              <w:t>ema_item_response</w:t>
+            </w:r>
+          </w:p>
+        </w:tc>
+        <w:tc>
+          <w:tcPr>
+            <w:tcW w:type="dxa" w:w="3249"/>
+          </w:tcPr>
+          <w:p>
+            <w:r>
+              <w:t>item_id</w:t>
+            </w:r>
+          </w:p>
+        </w:tc>
+        <w:tc>
+          <w:tcPr>
+            <w:tcW w:type="dxa" w:w="3249"/>
+          </w:tcPr>
+          <w:p>
+            <w:r>
+              <w:t>EMA item bank — which momentary item (B1–B8) this answer is for</w:t>
+            </w:r>
+          </w:p>
+        </w:tc>
+      </w:tr>
+      <w:tr>
+        <w:tc>
+          <w:tcPr>
+            <w:tcW w:type="dxa" w:w="3249"/>
+          </w:tcPr>
+          <w:p>
+            <w:r>
+              <w:t>ema_item_response</w:t>
+            </w:r>
+          </w:p>
+        </w:tc>
+        <w:tc>
+          <w:tcPr>
+            <w:tcW w:type="dxa" w:w="3249"/>
+          </w:tcPr>
+          <w:p>
+            <w:r>
+              <w:t>value</w:t>
+            </w:r>
+          </w:p>
+        </w:tc>
+        <w:tc>
+          <w:tcPr>
+            <w:tcW w:type="dxa" w:w="3249"/>
+          </w:tcPr>
+          <w:p>
+            <w:r>
+              <w:t>EMA item bank — 1–7 Likert response to that item</w:t>
+            </w:r>
+          </w:p>
+        </w:tc>
+      </w:tr>
     </w:tbl>
     <w:p>
       <w:r>
@@ -8084,12 +8822,7 @@
         <w:jc w:val="center"/>
       </w:pPr>
       <w:r>
-        <w:rPr>
-          <w:i/>
-          <w:color w:val="444444"/>
-          <w:sz w:val="16"/>
-        </w:rPr>
-        <w:t>Last updated: 2026-07-16 · Author: Dustin Nguyen · SMASH Research Lab, UF</w:t>
+        <w:t>Last updated: 2026-08-13 · Author: Dustin Nguyen · SMASH Research Lab, UF</w:t>
       </w:r>
     </w:p>
     <w:sectPr>

</xml_diff>